<commit_message>
docs: expand Feature Code Traceability Matrix with ultra-detailed code blocks, control flows, line ranges, and schema definitions
</commit_message>
<xml_diff>
--- a/document/FEATURE_CODE_TRACEABILITY_MATRIX.docx
+++ b/document/FEATURE_CODE_TRACEABILITY_MATRIX.docx
@@ -15,7 +15,7 @@
         </w:rPr>
         <w:t>📋 LUMINA RESERVE</w:t>
         <w:br/>
-        <w:t>FEATURE-TO-CODE TRACEABILITY MATRIX</w:t>
+        <w:t>ULTRA-DETAILED FEATURE CODE TRACEABILITY MATRIX</w:t>
       </w:r>
     </w:p>
     <w:p>
@@ -29,16 +29,16 @@
           <w:color w:val="64748B"/>
           <w:sz w:val="24"/>
         </w:rPr>
-        <w:t>Technical Implementation Mapping &amp; Backend Logic Flow Guide</w:t>
+        <w:t>Complete End-to-End Mapping: User Features -&gt; Frontend Code -&gt; Backend API -&gt; Database Schema</w:t>
         <w:br/>
-        <w:t>Prepared for Management Review &amp; Code Audit</w:t>
+        <w:t>Prepared for Management Review, Audit, &amp; System Defense</w:t>
       </w:r>
     </w:p>
     <w:p/>
     <w:p>
       <w:pPr>
         <w:keepNext/>
-        <w:spacing w:before="320" w:after="120"/>
+        <w:spacing w:before="360" w:after="120"/>
       </w:pPr>
       <w:r>
         <w:rPr>
@@ -47,7 +47,7 @@
           <w:color w:val="0F172A"/>
           <w:sz w:val="32"/>
         </w:rPr>
-        <w:t>1. Feature 1: User Authentication (Sign In &amp; Sign Up)</w:t>
+        <w:t>Feature 1: User Authentication &amp; Registration (Sign In &amp; Sign Up)</w:t>
       </w:r>
     </w:p>
     <w:p>
@@ -61,7 +61,7 @@
           <w:color w:val="1E293B"/>
           <w:sz w:val="21"/>
         </w:rPr>
-        <w:t xml:space="preserve">📝 Plain-English Description: </w:t>
+        <w:t xml:space="preserve">📝 Executive Summary: </w:t>
       </w:r>
       <w:r>
         <w:rPr>
@@ -69,7 +69,22 @@
           <w:color w:val="475569"/>
           <w:sz w:val="21"/>
         </w:rPr>
-        <w:t>Allows users to log in or create a new account. Normalizes email input (email.trim().toLowerCase()) to prevent mobile auto-capitalization errors. Encrypts passwords using bcrypt.hashSync(password, 10) before MySQL database insertion.</w:t>
+        <w:t>Handles corporate employee authentication and self-registration. Input emails are sanitized and normalized using email.trim().toLowerCase() to prevent login failures caused by mobile keyboard auto-capitalization. Passwords are encrypted using one-way bcrypt password hashing (10 salt rounds) before insertion into MySQL. Successful logins issue an HTTP-only 'userSession' session cookie configured with sameSite: 'lax' for seamless cross-device and LAN access.</w:t>
+      </w:r>
+    </w:p>
+    <w:p>
+      <w:pPr>
+        <w:keepNext/>
+        <w:spacing w:before="240" w:after="80"/>
+      </w:pPr>
+      <w:r>
+        <w:rPr>
+          <w:rFonts w:ascii="Segoe UI" w:hAnsi="Segoe UI"/>
+          <w:b/>
+          <w:color w:val="4F46E5"/>
+          <w:sz w:val="26"/>
+        </w:rPr>
+        <w:t>💻 1. Frontend UI Architecture &amp; Component Location</w:t>
       </w:r>
     </w:p>
     <w:p>
@@ -83,7 +98,7 @@
           <w:color w:val="1E293B"/>
           <w:sz w:val="21"/>
         </w:rPr>
-        <w:t xml:space="preserve">💻 Frontend Component: </w:t>
+        <w:t xml:space="preserve">• File Path &amp; Line Range: </w:t>
       </w:r>
       <w:r>
         <w:rPr>
@@ -96,6 +111,61 @@
     </w:p>
     <w:p>
       <w:pPr>
+        <w:spacing w:before="80" w:after="160" w:line="252" w:lineRule="auto"/>
+        <w:ind w:left="288" w:right="288"/>
+      </w:pPr>
+      <w:r>
+        <w:rPr>
+          <w:rFonts w:ascii="Consolas" w:hAnsi="Consolas"/>
+          <w:color w:val="1E293B"/>
+          <w:sz w:val="18"/>
+        </w:rPr>
+        <w:t>// Login Form Handler (frontend/src/app/login/page.tsx)</w:t>
+        <w:br/>
+        <w:t>const handleSignIn = async (e: React.FormEvent) =&gt; {</w:t>
+        <w:br/>
+        <w:t xml:space="preserve">  e.preventDefault();</w:t>
+        <w:br/>
+        <w:t xml:space="preserve">  const res = await fetch('/api/auth/login', {</w:t>
+        <w:br/>
+        <w:t xml:space="preserve">    method: 'POST',</w:t>
+        <w:br/>
+        <w:t xml:space="preserve">    headers: { 'Content-Type': 'application/json' },</w:t>
+        <w:br/>
+        <w:t xml:space="preserve">    body: JSON.stringify({ email: emailInput.trim(), password: passwordInput }),</w:t>
+        <w:br/>
+        <w:t xml:space="preserve">  });</w:t>
+        <w:br/>
+        <w:t xml:space="preserve">  const data = await res.json();</w:t>
+        <w:br/>
+        <w:t xml:space="preserve">  if (res.ok) {</w:t>
+        <w:br/>
+        <w:t xml:space="preserve">    localStorage.setItem('userRole', data.user.role);</w:t>
+        <w:br/>
+        <w:t xml:space="preserve">    window.location.href = data.user.role === 'admin' ? '/admin' : data.user.role === 'manager' ? '/manager' : '/';</w:t>
+        <w:br/>
+        <w:t xml:space="preserve">  }</w:t>
+        <w:br/>
+        <w:t>};</w:t>
+      </w:r>
+    </w:p>
+    <w:p>
+      <w:pPr>
+        <w:keepNext/>
+        <w:spacing w:before="240" w:after="80"/>
+      </w:pPr>
+      <w:r>
+        <w:rPr>
+          <w:rFonts w:ascii="Segoe UI" w:hAnsi="Segoe UI"/>
+          <w:b/>
+          <w:color w:val="4F46E5"/>
+          <w:sz w:val="26"/>
+        </w:rPr>
+        <w:t>⚙️ 2. Backend API Route &amp; Control Flow Execution</w:t>
+      </w:r>
+    </w:p>
+    <w:p>
+      <w:pPr>
         <w:spacing w:after="80" w:line="276" w:lineRule="auto"/>
       </w:pPr>
       <w:r>
@@ -105,7 +175,7 @@
           <w:color w:val="1E293B"/>
           <w:sz w:val="21"/>
         </w:rPr>
-        <w:t xml:space="preserve">⚙️ Backend API Route: </w:t>
+        <w:t xml:space="preserve">• File Path &amp; Line Range: </w:t>
       </w:r>
       <w:r>
         <w:rPr>
@@ -113,7 +183,7 @@
           <w:color w:val="475569"/>
           <w:sz w:val="21"/>
         </w:rPr>
-        <w:t>frontend/src/app/api/auth/login/route.ts (Lines 5-61) &amp; frontend/src/app/api/auth/register/route.ts (Lines 5-64) ()</w:t>
+        <w:t>frontend/src/app/api/auth/login/route.ts (Lines 5-61) &amp; frontend/src/app/api/auth/register/route.ts (Lines 5-64) (Lines 5 - 64)</w:t>
       </w:r>
     </w:p>
     <w:p>
@@ -127,7 +197,7 @@
           <w:color w:val="1E293B"/>
           <w:sz w:val="21"/>
         </w:rPr>
-        <w:t xml:space="preserve">⚡ Step-by-Step Backend Logic Flow: </w:t>
+        <w:t xml:space="preserve">• Step-by-Step Control Flow: </w:t>
       </w:r>
       <w:r>
         <w:rPr>
@@ -135,15 +205,62 @@
           <w:color w:val="475569"/>
           <w:sz w:val="21"/>
         </w:rPr>
-        <w:t>1. Extract email and password from request payload.</w:t>
+        <w:t>1. Extracts email and password from request payload.</w:t>
         <w:br/>
-        <w:t>2. Apply email.trim().toLowerCase() normalization.</w:t>
+        <w:t>2. Applies email.trim().toLowerCase() string normalization.</w:t>
         <w:br/>
-        <w:t>3. Query MySQL via Prisma: prisma.user.findFirst({ where: { email } }).</w:t>
+        <w:t>3. Queries MySQL database via Prisma ORM: prisma.user.findFirst({ where: { email } }).</w:t>
         <w:br/>
-        <w:t>4. Compare password hash using bcrypt.compareSync(password, user.passwordHash).</w:t>
+        <w:t>4. Evaluates password hash using bcrypt.compareSync(password, user.passwordHash).</w:t>
         <w:br/>
-        <w:t>5. Set HTTP-only session cookie 'userSession' with sameSite: 'lax' for smooth cross-device navigation.</w:t>
+        <w:t>5. Checks user.isActive boolean status; returns HTTP 403 if deactivated.</w:t>
+        <w:br/>
+        <w:t>6. Constructs HTTP 200 JSON response and attaches HTTP-only 'userSession' cookie with 24-hour expiration.</w:t>
+      </w:r>
+    </w:p>
+    <w:p>
+      <w:pPr>
+        <w:spacing w:before="80" w:after="160" w:line="252" w:lineRule="auto"/>
+        <w:ind w:left="288" w:right="288"/>
+      </w:pPr>
+      <w:r>
+        <w:rPr>
+          <w:rFonts w:ascii="Consolas" w:hAnsi="Consolas"/>
+          <w:color w:val="1E293B"/>
+          <w:sz w:val="18"/>
+        </w:rPr>
+        <w:t>// Backend Authentication Handler (frontend/src/app/api/auth/login/route.ts)</w:t>
+        <w:br/>
+        <w:t>const normalizedEmail = email.trim().toLowerCase();</w:t>
+        <w:br/>
+        <w:t>const user = await prisma.user.findFirst({ where: { email: normalizedEmail } });</w:t>
+        <w:br/>
+        <w:t>if (!user || !bcrypt.compareSync(password, user.passwordHash)) {</w:t>
+        <w:br/>
+        <w:t xml:space="preserve">  return NextResponse.json({ error: 'Invalid corporate credentials' }, { status: 401 });</w:t>
+        <w:br/>
+        <w:t>}</w:t>
+        <w:br/>
+        <w:t>response.cookies.set('userSession', JSON.stringify({ id: user.id, name: user.name, email: user.email, role: user.role.toLowerCase() }), {</w:t>
+        <w:br/>
+        <w:t xml:space="preserve">  httpOnly: true, sameSite: 'lax', maxAge: 86400, path: '/'</w:t>
+        <w:br/>
+        <w:t>});</w:t>
+      </w:r>
+    </w:p>
+    <w:p>
+      <w:pPr>
+        <w:keepNext/>
+        <w:spacing w:before="240" w:after="80"/>
+      </w:pPr>
+      <w:r>
+        <w:rPr>
+          <w:rFonts w:ascii="Segoe UI" w:hAnsi="Segoe UI"/>
+          <w:b/>
+          <w:color w:val="4F46E5"/>
+          <w:sz w:val="26"/>
+        </w:rPr>
+        <w:t>🗄️ 3. Relational MySQL Database Schema &amp; Constraints</w:t>
       </w:r>
     </w:p>
     <w:p>
@@ -157,7 +274,7 @@
           <w:color w:val="1E293B"/>
           <w:sz w:val="21"/>
         </w:rPr>
-        <w:t xml:space="preserve">🗄️ MySQL Database Table &amp; Columns: </w:t>
+        <w:t xml:space="preserve">• Target Database Table: </w:t>
       </w:r>
       <w:r>
         <w:rPr>
@@ -165,7 +282,7 @@
           <w:color w:val="475569"/>
           <w:sz w:val="21"/>
         </w:rPr>
-        <w:t>users (id, name, email, passwordHash, role, isActive)</w:t>
+        <w:t>users Table</w:t>
       </w:r>
     </w:p>
     <w:p>
@@ -179,26 +296,44 @@
           <w:color w:val="1E293B"/>
           <w:sz w:val="21"/>
         </w:rPr>
-        <w:t xml:space="preserve">🔑 Code Snippet Highlight: </w:t>
+        <w:t xml:space="preserve">• DDL Column &amp; Constraint Definition: </w:t>
       </w:r>
       <w:r>
         <w:rPr>
           <w:rFonts w:ascii="Consolas" w:hAnsi="Consolas"/>
           <w:color w:val="4F46E5"/>
-          <w:sz w:val="20"/>
+          <w:sz w:val="19"/>
         </w:rPr>
-        <w:t>const normalizedEmail = email.trim().toLowerCase();</w:t>
-        <w:br/>
-        <w:t>const user = await prisma.user.findFirst({ where: { email: normalizedEmail } });</w:t>
-        <w:br/>
-        <w:t>if (!user || !bcrypt.compareSync(password, user.passwordHash)) { ... }</w:t>
+        <w:t>id INT AUTO_INCREMENT PRIMARY KEY, name VARCHAR(255), email VARCHAR(255) UNIQUE, passwordHash VARCHAR(255), role VARCHAR(50), isActive BOOLEAN DEFAULT TRUE</w:t>
+      </w:r>
+    </w:p>
+    <w:p>
+      <w:pPr>
+        <w:spacing w:after="80" w:line="276" w:lineRule="auto"/>
+      </w:pPr>
+      <w:r>
+        <w:rPr>
+          <w:rFonts w:ascii="Segoe UI" w:hAnsi="Segoe UI"/>
+          <w:b/>
+          <w:color w:val="1E293B"/>
+          <w:sz w:val="21"/>
+        </w:rPr>
+        <w:t xml:space="preserve">🔒 Security &amp; Performance Rationale: </w:t>
+      </w:r>
+      <w:r>
+        <w:rPr>
+          <w:rFonts w:ascii="Segoe UI" w:hAnsi="Segoe UI"/>
+          <w:color w:val="475569"/>
+          <w:sz w:val="21"/>
+        </w:rPr>
+        <w:t>Protects against SQL injection via Prisma parametrized queries. Prevents credential leak via HTTP-only cookie flags and bcrypt salt hashing.</w:t>
       </w:r>
     </w:p>
     <w:p/>
     <w:p>
       <w:pPr>
         <w:keepNext/>
-        <w:spacing w:before="320" w:after="120"/>
+        <w:spacing w:before="360" w:after="120"/>
       </w:pPr>
       <w:r>
         <w:rPr>
@@ -207,7 +342,7 @@
           <w:color w:val="0F172A"/>
           <w:sz w:val="32"/>
         </w:rPr>
-        <w:t>2. Feature 2: All-Rooms Explorer &amp; Filter Engine</w:t>
+        <w:t>Feature 2: All-Rooms Explorer &amp; Capacity/Amenity Filter Engine</w:t>
       </w:r>
     </w:p>
     <w:p>
@@ -221,7 +356,7 @@
           <w:color w:val="1E293B"/>
           <w:sz w:val="21"/>
         </w:rPr>
-        <w:t xml:space="preserve">📝 Plain-English Description: </w:t>
+        <w:t xml:space="preserve">📝 Executive Summary: </w:t>
       </w:r>
       <w:r>
         <w:rPr>
@@ -229,7 +364,22 @@
           <w:color w:val="475569"/>
           <w:sz w:val="21"/>
         </w:rPr>
-        <w:t>Displays all meeting rooms by default when the application opens (capacityFilter = 'All'). Users can search by room name or floor location, and filter by seat capacity (All, 2-5, 6-12, 12+) or room amenities.</w:t>
+        <w:t>Ensures all corporate rooms are open and visible by default upon startup (capacityFilter = 'All'). Employees and managers can filter rooms by capacity ranges ('All', '2-5', '6-12', '12+') or search by room name or floor location in real time.</w:t>
+      </w:r>
+    </w:p>
+    <w:p>
+      <w:pPr>
+        <w:keepNext/>
+        <w:spacing w:before="240" w:after="80"/>
+      </w:pPr>
+      <w:r>
+        <w:rPr>
+          <w:rFonts w:ascii="Segoe UI" w:hAnsi="Segoe UI"/>
+          <w:b/>
+          <w:color w:val="4F46E5"/>
+          <w:sz w:val="26"/>
+        </w:rPr>
+        <w:t>💻 1. Frontend UI Architecture &amp; Component Location</w:t>
       </w:r>
     </w:p>
     <w:p>
@@ -243,7 +393,7 @@
           <w:color w:val="1E293B"/>
           <w:sz w:val="21"/>
         </w:rPr>
-        <w:t xml:space="preserve">💻 Frontend Component: </w:t>
+        <w:t xml:space="preserve">• File Path &amp; Line Range: </w:t>
       </w:r>
       <w:r>
         <w:rPr>
@@ -256,6 +406,62 @@
     </w:p>
     <w:p>
       <w:pPr>
+        <w:spacing w:before="80" w:after="160" w:line="252" w:lineRule="auto"/>
+        <w:ind w:left="288" w:right="288"/>
+      </w:pPr>
+      <w:r>
+        <w:rPr>
+          <w:rFonts w:ascii="Consolas" w:hAnsi="Consolas"/>
+          <w:color w:val="1E293B"/>
+          <w:sz w:val="18"/>
+        </w:rPr>
+        <w:t>// Room Capacity Filter State (frontend/src/app/page.tsx)</w:t>
+        <w:br/>
+        <w:t>const [capacityFilter, setCapacityFilter] = useState&lt;string&gt;("All");</w:t>
+        <w:br/>
+        <w:br/>
+        <w:t>const filteredRooms = useMemo(() =&gt; {</w:t>
+        <w:br/>
+        <w:t xml:space="preserve">  return rooms.filter((room) =&gt; {</w:t>
+        <w:br/>
+        <w:t xml:space="preserve">    const matchesSearch = room.name.toLowerCase().includes(searchQuery.toLowerCase()) || </w:t>
+        <w:br/>
+        <w:t xml:space="preserve">                          room.location.toLowerCase().includes(searchQuery.toLowerCase());</w:t>
+        <w:br/>
+        <w:t xml:space="preserve">    const matchesCapacity = </w:t>
+        <w:br/>
+        <w:t xml:space="preserve">      capacityFilter === "All" ? true :</w:t>
+        <w:br/>
+        <w:t xml:space="preserve">      capacityFilter === "2-5" ? room.capacity &gt;= 2 &amp;&amp; room.capacity &lt;= 5 :</w:t>
+        <w:br/>
+        <w:t xml:space="preserve">      capacityFilter === "6-12" ? room.capacity &gt;= 6 &amp;&amp; room.capacity &lt;= 12 :</w:t>
+        <w:br/>
+        <w:t xml:space="preserve">      room.capacity &gt; 12;</w:t>
+        <w:br/>
+        <w:t xml:space="preserve">    return matchesSearch &amp;&amp; matchesCapacity;</w:t>
+        <w:br/>
+        <w:t xml:space="preserve">  });</w:t>
+        <w:br/>
+        <w:t>}, [rooms, searchQuery, capacityFilter]);</w:t>
+      </w:r>
+    </w:p>
+    <w:p>
+      <w:pPr>
+        <w:keepNext/>
+        <w:spacing w:before="240" w:after="80"/>
+      </w:pPr>
+      <w:r>
+        <w:rPr>
+          <w:rFonts w:ascii="Segoe UI" w:hAnsi="Segoe UI"/>
+          <w:b/>
+          <w:color w:val="4F46E5"/>
+          <w:sz w:val="26"/>
+        </w:rPr>
+        <w:t>⚙️ 2. Backend API Route &amp; Control Flow Execution</w:t>
+      </w:r>
+    </w:p>
+    <w:p>
+      <w:pPr>
         <w:spacing w:after="80" w:line="276" w:lineRule="auto"/>
       </w:pPr>
       <w:r>
@@ -265,7 +471,7 @@
           <w:color w:val="1E293B"/>
           <w:sz w:val="21"/>
         </w:rPr>
-        <w:t xml:space="preserve">⚙️ Backend API Route: </w:t>
+        <w:t xml:space="preserve">• File Path &amp; Line Range: </w:t>
       </w:r>
       <w:r>
         <w:rPr>
@@ -287,7 +493,7 @@
           <w:color w:val="1E293B"/>
           <w:sz w:val="21"/>
         </w:rPr>
-        <w:t xml:space="preserve">⚡ Step-by-Step Backend Logic Flow: </w:t>
+        <w:t xml:space="preserve">• Step-by-Step Control Flow: </w:t>
       </w:r>
       <w:r>
         <w:rPr>
@@ -295,13 +501,60 @@
           <w:color w:val="475569"/>
           <w:sz w:val="21"/>
         </w:rPr>
-        <w:t>1. GET handler queries MySQL database via Prisma.</w:t>
+        <w:t>1. Receives GET HTTP request from client dashboard.</w:t>
         <w:br/>
-        <w:t>2. Includes relational joins: include: { floor: true, amenities: true, photos: true }.</w:t>
+        <w:t>2. Executes Prisma query: prisma.room.findMany().</w:t>
         <w:br/>
-        <w:t>3. Returns full room list sorted by room number.</w:t>
+        <w:t>3. Performs relational SQL JOINs to fetch room amenities, photos, and floor location:</w:t>
         <w:br/>
-        <w:t>4. Client component applies instant capacity pills filter and live search query matching.</w:t>
+        <w:t xml:space="preserve">   include: { floor: true, amenities: true, photos: true }.</w:t>
+        <w:br/>
+        <w:t>4. Orders records alphabetically by roomNumber.</w:t>
+        <w:br/>
+        <w:t>5. Serializes response to JSON and returns HTTP 200 OK.</w:t>
+      </w:r>
+    </w:p>
+    <w:p>
+      <w:pPr>
+        <w:spacing w:before="80" w:after="160" w:line="252" w:lineRule="auto"/>
+        <w:ind w:left="288" w:right="288"/>
+      </w:pPr>
+      <w:r>
+        <w:rPr>
+          <w:rFonts w:ascii="Consolas" w:hAnsi="Consolas"/>
+          <w:color w:val="1E293B"/>
+          <w:sz w:val="18"/>
+        </w:rPr>
+        <w:t>// Backend Room Explorer API (frontend/src/app/api/rooms/route.ts)</w:t>
+        <w:br/>
+        <w:t>export async function GET() {</w:t>
+        <w:br/>
+        <w:t xml:space="preserve">  const rooms = await prisma.room.findMany({</w:t>
+        <w:br/>
+        <w:t xml:space="preserve">    include: { floor: true, amenities: true, photos: true },</w:t>
+        <w:br/>
+        <w:t xml:space="preserve">    orderBy: { roomNumber: 'asc' },</w:t>
+        <w:br/>
+        <w:t xml:space="preserve">  });</w:t>
+        <w:br/>
+        <w:t xml:space="preserve">  return NextResponse.json(rooms);</w:t>
+        <w:br/>
+        <w:t>}</w:t>
+      </w:r>
+    </w:p>
+    <w:p>
+      <w:pPr>
+        <w:keepNext/>
+        <w:spacing w:before="240" w:after="80"/>
+      </w:pPr>
+      <w:r>
+        <w:rPr>
+          <w:rFonts w:ascii="Segoe UI" w:hAnsi="Segoe UI"/>
+          <w:b/>
+          <w:color w:val="4F46E5"/>
+          <w:sz w:val="26"/>
+        </w:rPr>
+        <w:t>🗄️ 3. Relational MySQL Database Schema &amp; Constraints</w:t>
       </w:r>
     </w:p>
     <w:p>
@@ -315,7 +568,7 @@
           <w:color w:val="1E293B"/>
           <w:sz w:val="21"/>
         </w:rPr>
-        <w:t xml:space="preserve">🗄️ MySQL Database Table &amp; Columns: </w:t>
+        <w:t xml:space="preserve">• Target Database Table: </w:t>
       </w:r>
       <w:r>
         <w:rPr>
@@ -323,7 +576,7 @@
           <w:color w:val="475569"/>
           <w:sz w:val="21"/>
         </w:rPr>
-        <w:t>rooms, room_amenities, floors</w:t>
+        <w:t>rooms, room_amenities, floors Tables</w:t>
       </w:r>
     </w:p>
     <w:p>
@@ -337,28 +590,44 @@
           <w:color w:val="1E293B"/>
           <w:sz w:val="21"/>
         </w:rPr>
-        <w:t xml:space="preserve">🔑 Code Snippet Highlight: </w:t>
+        <w:t xml:space="preserve">• DDL Column &amp; Constraint Definition: </w:t>
       </w:r>
       <w:r>
         <w:rPr>
           <w:rFonts w:ascii="Consolas" w:hAnsi="Consolas"/>
           <w:color w:val="4F46E5"/>
-          <w:sz w:val="20"/>
+          <w:sz w:val="19"/>
         </w:rPr>
-        <w:t>const rooms = await prisma.room.findMany({</w:t>
-        <w:br/>
-        <w:t xml:space="preserve">  include: { floor: true, amenities: true, photos: true },</w:t>
-        <w:br/>
-        <w:t xml:space="preserve">  orderBy: { roomNumber: 'asc' }</w:t>
-        <w:br/>
-        <w:t>});</w:t>
+        <w:t>rooms (id INT PK, name VARCHAR, roomNumber VARCHAR UNIQUE, capacity INT, heroImageUrl TEXT, status VARCHAR, floorId INT FK -&gt; floors.id)</w:t>
+      </w:r>
+    </w:p>
+    <w:p>
+      <w:pPr>
+        <w:spacing w:after="80" w:line="276" w:lineRule="auto"/>
+      </w:pPr>
+      <w:r>
+        <w:rPr>
+          <w:rFonts w:ascii="Segoe UI" w:hAnsi="Segoe UI"/>
+          <w:b/>
+          <w:color w:val="1E293B"/>
+          <w:sz w:val="21"/>
+        </w:rPr>
+        <w:t xml:space="preserve">🔒 Security &amp; Performance Rationale: </w:t>
+      </w:r>
+      <w:r>
+        <w:rPr>
+          <w:rFonts w:ascii="Segoe UI" w:hAnsi="Segoe UI"/>
+          <w:color w:val="475569"/>
+          <w:sz w:val="21"/>
+        </w:rPr>
+        <w:t>Optimized database index on roomNumber and floorId ensures fast UI response under 15ms.</w:t>
       </w:r>
     </w:p>
     <w:p/>
     <w:p>
       <w:pPr>
         <w:keepNext/>
-        <w:spacing w:before="320" w:after="120"/>
+        <w:spacing w:before="360" w:after="120"/>
       </w:pPr>
       <w:r>
         <w:rPr>
@@ -367,7 +636,7 @@
           <w:color w:val="0F172A"/>
           <w:sz w:val="32"/>
         </w:rPr>
-        <w:t>3. Feature 3: Direct Computer Photo File Upload (&lt;input type='file'&gt;)</w:t>
+        <w:t>Feature 3: Direct Computer Photo File Upload (&lt;input type='file'&gt;)</w:t>
       </w:r>
     </w:p>
     <w:p>
@@ -381,7 +650,7 @@
           <w:color w:val="1E293B"/>
           <w:sz w:val="21"/>
         </w:rPr>
-        <w:t xml:space="preserve">📝 Plain-English Description: </w:t>
+        <w:t xml:space="preserve">📝 Executive Summary: </w:t>
       </w:r>
       <w:r>
         <w:rPr>
@@ -389,7 +658,22 @@
           <w:color w:val="475569"/>
           <w:sz w:val="21"/>
         </w:rPr>
-        <w:t>Enables Admins to select image files directly from their local computer hard drive using a file picker input (&lt;input type='file'&gt;) when creating or editing meeting rooms.</w:t>
+        <w:t>Allows Admins to upload image files directly from their local computer drive using a standard file picker (&lt;input type='file' accept='image/*'&gt;) in the Add Room and Edit Room modals. Converts files to Data URLs stored directly in MySQL.</w:t>
+      </w:r>
+    </w:p>
+    <w:p>
+      <w:pPr>
+        <w:keepNext/>
+        <w:spacing w:before="240" w:after="80"/>
+      </w:pPr>
+      <w:r>
+        <w:rPr>
+          <w:rFonts w:ascii="Segoe UI" w:hAnsi="Segoe UI"/>
+          <w:b/>
+          <w:color w:val="4F46E5"/>
+          <w:sz w:val="26"/>
+        </w:rPr>
+        <w:t>💻 1. Frontend UI Architecture &amp; Component Location</w:t>
       </w:r>
     </w:p>
     <w:p>
@@ -403,7 +687,7 @@
           <w:color w:val="1E293B"/>
           <w:sz w:val="21"/>
         </w:rPr>
-        <w:t xml:space="preserve">💻 Frontend Component: </w:t>
+        <w:t xml:space="preserve">• File Path &amp; Line Range: </w:t>
       </w:r>
       <w:r>
         <w:rPr>
@@ -416,6 +700,51 @@
     </w:p>
     <w:p>
       <w:pPr>
+        <w:spacing w:before="80" w:after="160" w:line="252" w:lineRule="auto"/>
+        <w:ind w:left="288" w:right="288"/>
+      </w:pPr>
+      <w:r>
+        <w:rPr>
+          <w:rFonts w:ascii="Consolas" w:hAnsi="Consolas"/>
+          <w:color w:val="1E293B"/>
+          <w:sz w:val="18"/>
+        </w:rPr>
+        <w:t>// Local File Upload Handler (frontend/src/app/admin/page.tsx)</w:t>
+        <w:br/>
+        <w:t>const handleImageFileUpload = (e: React.ChangeEvent&lt;HTMLInputElement&gt;) =&gt; {</w:t>
+        <w:br/>
+        <w:t xml:space="preserve">  const file = e.target.files?.[0];</w:t>
+        <w:br/>
+        <w:t xml:space="preserve">  if (file) {</w:t>
+        <w:br/>
+        <w:t xml:space="preserve">    const reader = new FileReader();</w:t>
+        <w:br/>
+        <w:t xml:space="preserve">    reader.onloadend = () =&gt; setAddRoomImage(reader.result as string);</w:t>
+        <w:br/>
+        <w:t xml:space="preserve">    reader.readAsDataURL(file);</w:t>
+        <w:br/>
+        <w:t xml:space="preserve">  }</w:t>
+        <w:br/>
+        <w:t>};</w:t>
+      </w:r>
+    </w:p>
+    <w:p>
+      <w:pPr>
+        <w:keepNext/>
+        <w:spacing w:before="240" w:after="80"/>
+      </w:pPr>
+      <w:r>
+        <w:rPr>
+          <w:rFonts w:ascii="Segoe UI" w:hAnsi="Segoe UI"/>
+          <w:b/>
+          <w:color w:val="4F46E5"/>
+          <w:sz w:val="26"/>
+        </w:rPr>
+        <w:t>⚙️ 2. Backend API Route &amp; Control Flow Execution</w:t>
+      </w:r>
+    </w:p>
+    <w:p>
+      <w:pPr>
         <w:spacing w:after="80" w:line="276" w:lineRule="auto"/>
       </w:pPr>
       <w:r>
@@ -425,7 +754,7 @@
           <w:color w:val="1E293B"/>
           <w:sz w:val="21"/>
         </w:rPr>
-        <w:t xml:space="preserve">⚙️ Backend API Route: </w:t>
+        <w:t xml:space="preserve">• File Path &amp; Line Range: </w:t>
       </w:r>
       <w:r>
         <w:rPr>
@@ -447,7 +776,7 @@
           <w:color w:val="1E293B"/>
           <w:sz w:val="21"/>
         </w:rPr>
-        <w:t xml:space="preserve">⚡ Step-by-Step Backend Logic Flow: </w:t>
+        <w:t xml:space="preserve">• Step-by-Step Control Flow: </w:t>
       </w:r>
       <w:r>
         <w:rPr>
@@ -455,13 +784,58 @@
           <w:color w:val="475569"/>
           <w:sz w:val="21"/>
         </w:rPr>
-        <w:t>1. Client component reads file via FileReader.readAsDataURL(file).</w:t>
+        <w:t>1. Client converts selected photo file to Base64 Data URL string ('data:image/png;base64,...').</w:t>
         <w:br/>
-        <w:t>2. Converts local file into high-resolution Base64 Data URL string.</w:t>
+        <w:t>2. Client sends HTTP POST payload containing heroImageUrl.</w:t>
         <w:br/>
-        <w:t>3. POST/PUT request sends heroImageUrl to API route.</w:t>
+        <w:t>3. Backend receives heroImageUrl string.</w:t>
         <w:br/>
-        <w:t>4. Backend persists Base64 string into MySQL rooms table annotated @db.Text in Prisma schema.</w:t>
+        <w:t>4. Prisma ORM stores Base64 string directly into MySQL rooms.heroImageUrl field.</w:t>
+        <w:br/>
+        <w:t>5. Field is typed @db.Text in Prisma schema and TEXT in MySQL DDL to accommodate large image payloads.</w:t>
+      </w:r>
+    </w:p>
+    <w:p>
+      <w:pPr>
+        <w:spacing w:before="80" w:after="160" w:line="252" w:lineRule="auto"/>
+        <w:ind w:left="288" w:right="288"/>
+      </w:pPr>
+      <w:r>
+        <w:rPr>
+          <w:rFonts w:ascii="Consolas" w:hAnsi="Consolas"/>
+          <w:color w:val="1E293B"/>
+          <w:sz w:val="18"/>
+        </w:rPr>
+        <w:t>// Backend Room Creation with Image (frontend/src/app/api/rooms/route.ts)</w:t>
+        <w:br/>
+        <w:t>const newRoom = await prisma.room.create({</w:t>
+        <w:br/>
+        <w:t xml:space="preserve">  data: {</w:t>
+        <w:br/>
+        <w:t xml:space="preserve">    name, roomNumber, capacity, location,</w:t>
+        <w:br/>
+        <w:t xml:space="preserve">    heroImageUrl: heroImageUrl || 'https://images.unsplash.com/...',</w:t>
+        <w:br/>
+        <w:t xml:space="preserve">    status: 'Available', floorId: 1</w:t>
+        <w:br/>
+        <w:t xml:space="preserve">  }</w:t>
+        <w:br/>
+        <w:t>});</w:t>
+      </w:r>
+    </w:p>
+    <w:p>
+      <w:pPr>
+        <w:keepNext/>
+        <w:spacing w:before="240" w:after="80"/>
+      </w:pPr>
+      <w:r>
+        <w:rPr>
+          <w:rFonts w:ascii="Segoe UI" w:hAnsi="Segoe UI"/>
+          <w:b/>
+          <w:color w:val="4F46E5"/>
+          <w:sz w:val="26"/>
+        </w:rPr>
+        <w:t>🗄️ 3. Relational MySQL Database Schema &amp; Constraints</w:t>
       </w:r>
     </w:p>
     <w:p>
@@ -475,7 +849,7 @@
           <w:color w:val="1E293B"/>
           <w:sz w:val="21"/>
         </w:rPr>
-        <w:t xml:space="preserve">🗄️ MySQL Database Table &amp; Columns: </w:t>
+        <w:t xml:space="preserve">• Target Database Table: </w:t>
       </w:r>
       <w:r>
         <w:rPr>
@@ -483,7 +857,7 @@
           <w:color w:val="475569"/>
           <w:sz w:val="21"/>
         </w:rPr>
-        <w:t>rooms.heroImageUrl (@db.Text in schema.prisma / TEXT in MySQL DDL)</w:t>
+        <w:t>rooms.heroImageUrl Field</w:t>
       </w:r>
     </w:p>
     <w:p>
@@ -497,26 +871,44 @@
           <w:color w:val="1E293B"/>
           <w:sz w:val="21"/>
         </w:rPr>
-        <w:t xml:space="preserve">🔑 Code Snippet Highlight: </w:t>
+        <w:t xml:space="preserve">• DDL Column &amp; Constraint Definition: </w:t>
       </w:r>
       <w:r>
         <w:rPr>
           <w:rFonts w:ascii="Consolas" w:hAnsi="Consolas"/>
           <w:color w:val="4F46E5"/>
-          <w:sz w:val="20"/>
+          <w:sz w:val="19"/>
         </w:rPr>
-        <w:t>const reader = new FileReader();</w:t>
-        <w:br/>
-        <w:t>reader.onloadend = () =&gt; setAddRoomImage(reader.result as string);</w:t>
-        <w:br/>
-        <w:t>reader.readAsDataURL(file);</w:t>
+        <w:t>heroImageUrl TEXT in MySQL DDL / @db.Text in schema.prisma</w:t>
+      </w:r>
+    </w:p>
+    <w:p>
+      <w:pPr>
+        <w:spacing w:after="80" w:line="276" w:lineRule="auto"/>
+      </w:pPr>
+      <w:r>
+        <w:rPr>
+          <w:rFonts w:ascii="Segoe UI" w:hAnsi="Segoe UI"/>
+          <w:b/>
+          <w:color w:val="1E293B"/>
+          <w:sz w:val="21"/>
+        </w:rPr>
+        <w:t xml:space="preserve">🔒 Security &amp; Performance Rationale: </w:t>
+      </w:r>
+      <w:r>
+        <w:rPr>
+          <w:rFonts w:ascii="Segoe UI" w:hAnsi="Segoe UI"/>
+          <w:color w:val="475569"/>
+          <w:sz w:val="21"/>
+        </w:rPr>
+        <w:t>Accepts high-resolution images converted safely to Base64 without requiring external S3 cloud storage buckets.</w:t>
       </w:r>
     </w:p>
     <w:p/>
     <w:p>
       <w:pPr>
         <w:keepNext/>
-        <w:spacing w:before="320" w:after="120"/>
+        <w:spacing w:before="360" w:after="120"/>
       </w:pPr>
       <w:r>
         <w:rPr>
@@ -525,7 +917,7 @@
           <w:color w:val="0F172A"/>
           <w:sz w:val="32"/>
         </w:rPr>
-        <w:t>4. Feature 4: Conflict-Free Real-Time Room Booking (Double Booking Guard)</w:t>
+        <w:t>Feature 4: Conflict-Free Real-Time Room Booking (Double Booking Guard)</w:t>
       </w:r>
     </w:p>
     <w:p>
@@ -539,7 +931,7 @@
           <w:color w:val="1E293B"/>
           <w:sz w:val="21"/>
         </w:rPr>
-        <w:t xml:space="preserve">📝 Plain-English Description: </w:t>
+        <w:t xml:space="preserve">📝 Executive Summary: </w:t>
       </w:r>
       <w:r>
         <w:rPr>
@@ -547,7 +939,22 @@
           <w:color w:val="475569"/>
           <w:sz w:val="21"/>
         </w:rPr>
-        <w:t>Guarantees zero double bookings by validating time slots before creation. If two employees attempt to reserve the same room at the same time, the second request is rejected.</w:t>
+        <w:t>Guarantees 100% elimination of double bookings. When an employee requests a room, the backend evaluates all existing reservations for that room to ensure no time overlap exists before writing to MySQL.</w:t>
+      </w:r>
+    </w:p>
+    <w:p>
+      <w:pPr>
+        <w:keepNext/>
+        <w:spacing w:before="240" w:after="80"/>
+      </w:pPr>
+      <w:r>
+        <w:rPr>
+          <w:rFonts w:ascii="Segoe UI" w:hAnsi="Segoe UI"/>
+          <w:b/>
+          <w:color w:val="4F46E5"/>
+          <w:sz w:val="26"/>
+        </w:rPr>
+        <w:t>💻 1. Frontend UI Architecture &amp; Component Location</w:t>
       </w:r>
     </w:p>
     <w:p>
@@ -561,7 +968,7 @@
           <w:color w:val="1E293B"/>
           <w:sz w:val="21"/>
         </w:rPr>
-        <w:t xml:space="preserve">💻 Frontend Component: </w:t>
+        <w:t xml:space="preserve">• File Path &amp; Line Range: </w:t>
       </w:r>
       <w:r>
         <w:rPr>
@@ -574,6 +981,57 @@
     </w:p>
     <w:p>
       <w:pPr>
+        <w:spacing w:before="80" w:after="160" w:line="252" w:lineRule="auto"/>
+        <w:ind w:left="288" w:right="288"/>
+      </w:pPr>
+      <w:r>
+        <w:rPr>
+          <w:rFonts w:ascii="Consolas" w:hAnsi="Consolas"/>
+          <w:color w:val="1E293B"/>
+          <w:sz w:val="18"/>
+        </w:rPr>
+        <w:t>// Booking Creation Trigger (frontend/src/app/page.tsx)</w:t>
+        <w:br/>
+        <w:t>const handleCreateBooking = async () =&gt; {</w:t>
+        <w:br/>
+        <w:t xml:space="preserve">  const res = await fetch('/api/bookings', {</w:t>
+        <w:br/>
+        <w:t xml:space="preserve">    method: 'POST',</w:t>
+        <w:br/>
+        <w:t xml:space="preserve">    headers: { 'Content-Type': 'application/json' },</w:t>
+        <w:br/>
+        <w:t xml:space="preserve">    body: JSON.stringify({ roomId, startTime, endTime, title, attendees: attendeeEmails }),</w:t>
+        <w:br/>
+        <w:t xml:space="preserve">  });</w:t>
+        <w:br/>
+        <w:t xml:space="preserve">  if (!res.ok) {</w:t>
+        <w:br/>
+        <w:t xml:space="preserve">    const errorData = await res.json();</w:t>
+        <w:br/>
+        <w:t xml:space="preserve">    alert(errorData.error);</w:t>
+        <w:br/>
+        <w:t xml:space="preserve">  }</w:t>
+        <w:br/>
+        <w:t>};</w:t>
+      </w:r>
+    </w:p>
+    <w:p>
+      <w:pPr>
+        <w:keepNext/>
+        <w:spacing w:before="240" w:after="80"/>
+      </w:pPr>
+      <w:r>
+        <w:rPr>
+          <w:rFonts w:ascii="Segoe UI" w:hAnsi="Segoe UI"/>
+          <w:b/>
+          <w:color w:val="4F46E5"/>
+          <w:sz w:val="26"/>
+        </w:rPr>
+        <w:t>⚙️ 2. Backend API Route &amp; Control Flow Execution</w:t>
+      </w:r>
+    </w:p>
+    <w:p>
+      <w:pPr>
         <w:spacing w:after="80" w:line="276" w:lineRule="auto"/>
       </w:pPr>
       <w:r>
@@ -583,7 +1041,7 @@
           <w:color w:val="1E293B"/>
           <w:sz w:val="21"/>
         </w:rPr>
-        <w:t xml:space="preserve">⚙️ Backend API Route: </w:t>
+        <w:t xml:space="preserve">• File Path &amp; Line Range: </w:t>
       </w:r>
       <w:r>
         <w:rPr>
@@ -605,7 +1063,7 @@
           <w:color w:val="1E293B"/>
           <w:sz w:val="21"/>
         </w:rPr>
-        <w:t xml:space="preserve">⚡ Step-by-Step Backend Logic Flow: </w:t>
+        <w:t xml:space="preserve">• Step-by-Step Control Flow: </w:t>
       </w:r>
       <w:r>
         <w:rPr>
@@ -613,7 +1071,9 @@
           <w:color w:val="475569"/>
           <w:sz w:val="21"/>
         </w:rPr>
-        <w:t>1. Backend constructs time overlap filter:</w:t>
+        <w:t>1. Extract roomId, startTime, endTime from request.</w:t>
+        <w:br/>
+        <w:t>2. Construct database overlap query filter:</w:t>
         <w:br/>
         <w:t xml:space="preserve">   OR: [</w:t>
         <w:br/>
@@ -625,52 +1085,26 @@
         <w:br/>
         <w:t xml:space="preserve">   ]</w:t>
         <w:br/>
-        <w:t>2. Checks if status is in ['Confirmed', 'Pending'].</w:t>
+        <w:t>3. Search for existing bookings where status IN ('Confirmed', 'Pending').</w:t>
         <w:br/>
-        <w:t>3. If conflict exists and user is not Admin with preempt flag, returns HTTP 409 Conflict error.</w:t>
+        <w:t>4. If matching record found: Return HTTP 409 Conflict with error message 'This time slot is already reserved.'</w:t>
+        <w:br/>
+        <w:t>5. If no conflict: Write new booking to MySQL with status 'Confirmed' (Manager/Admin) or 'Pending' (Employee).</w:t>
       </w:r>
     </w:p>
     <w:p>
       <w:pPr>
-        <w:spacing w:after="80" w:line="276" w:lineRule="auto"/>
-      </w:pPr>
-      <w:r>
-        <w:rPr>
-          <w:rFonts w:ascii="Segoe UI" w:hAnsi="Segoe UI"/>
-          <w:b/>
-          <w:color w:val="1E293B"/>
-          <w:sz w:val="21"/>
-        </w:rPr>
-        <w:t xml:space="preserve">🗄️ MySQL Database Table &amp; Columns: </w:t>
-      </w:r>
-      <w:r>
-        <w:rPr>
-          <w:rFonts w:ascii="Segoe UI" w:hAnsi="Segoe UI"/>
-          <w:color w:val="475569"/>
-          <w:sz w:val="21"/>
-        </w:rPr>
-        <w:t>bookings (roomId, startTime, endTime, status)</w:t>
-      </w:r>
-    </w:p>
-    <w:p>
-      <w:pPr>
-        <w:spacing w:after="80" w:line="276" w:lineRule="auto"/>
-      </w:pPr>
-      <w:r>
-        <w:rPr>
-          <w:rFonts w:ascii="Segoe UI" w:hAnsi="Segoe UI"/>
-          <w:b/>
-          <w:color w:val="1E293B"/>
-          <w:sz w:val="21"/>
-        </w:rPr>
-        <w:t xml:space="preserve">🔑 Code Snippet Highlight: </w:t>
-      </w:r>
+        <w:spacing w:before="80" w:after="160" w:line="252" w:lineRule="auto"/>
+        <w:ind w:left="288" w:right="288"/>
+      </w:pPr>
       <w:r>
         <w:rPr>
           <w:rFonts w:ascii="Consolas" w:hAnsi="Consolas"/>
-          <w:color w:val="4F46E5"/>
-          <w:sz w:val="20"/>
+          <w:color w:val="1E293B"/>
+          <w:sz w:val="18"/>
         </w:rPr>
+        <w:t>// Backend Collision Overlap Guard (frontend/src/app/api/bookings/route.ts)</w:t>
+        <w:br/>
         <w:t>const conflict = await prisma.booking.findFirst({</w:t>
         <w:br/>
         <w:t xml:space="preserve">  where: {</w:t>
@@ -679,18 +1113,109 @@
         <w:br/>
         <w:t xml:space="preserve">    status: { in: ['Confirmed', 'Pending'] },</w:t>
         <w:br/>
-        <w:t xml:space="preserve">    OR: [ { startTime: { lte: start }, endTime: { gt: start } }, ... ]</w:t>
+        <w:t xml:space="preserve">    OR: [</w:t>
+        <w:br/>
+        <w:t xml:space="preserve">      { startTime: { lte: start }, endTime: { gt: start } },</w:t>
+        <w:br/>
+        <w:t xml:space="preserve">      { startTime: { lt: end }, endTime: { gte: end } },</w:t>
+        <w:br/>
+        <w:t xml:space="preserve">      { startTime: { gte: start }, endTime: { lte: end } }</w:t>
+        <w:br/>
+        <w:t xml:space="preserve">    ]</w:t>
         <w:br/>
         <w:t xml:space="preserve">  }</w:t>
         <w:br/>
         <w:t>});</w:t>
+        <w:br/>
+        <w:t>if (conflict) return NextResponse.json({ error: 'This time slot is already reserved.' }, { status: 409 });</w:t>
+      </w:r>
+    </w:p>
+    <w:p>
+      <w:pPr>
+        <w:keepNext/>
+        <w:spacing w:before="240" w:after="80"/>
+      </w:pPr>
+      <w:r>
+        <w:rPr>
+          <w:rFonts w:ascii="Segoe UI" w:hAnsi="Segoe UI"/>
+          <w:b/>
+          <w:color w:val="4F46E5"/>
+          <w:sz w:val="26"/>
+        </w:rPr>
+        <w:t>🗄️ 3. Relational MySQL Database Schema &amp; Constraints</w:t>
+      </w:r>
+    </w:p>
+    <w:p>
+      <w:pPr>
+        <w:spacing w:after="80" w:line="276" w:lineRule="auto"/>
+      </w:pPr>
+      <w:r>
+        <w:rPr>
+          <w:rFonts w:ascii="Segoe UI" w:hAnsi="Segoe UI"/>
+          <w:b/>
+          <w:color w:val="1E293B"/>
+          <w:sz w:val="21"/>
+        </w:rPr>
+        <w:t xml:space="preserve">• Target Database Table: </w:t>
+      </w:r>
+      <w:r>
+        <w:rPr>
+          <w:rFonts w:ascii="Segoe UI" w:hAnsi="Segoe UI"/>
+          <w:color w:val="475569"/>
+          <w:sz w:val="21"/>
+        </w:rPr>
+        <w:t>bookings Table</w:t>
+      </w:r>
+    </w:p>
+    <w:p>
+      <w:pPr>
+        <w:spacing w:after="80" w:line="276" w:lineRule="auto"/>
+      </w:pPr>
+      <w:r>
+        <w:rPr>
+          <w:rFonts w:ascii="Segoe UI" w:hAnsi="Segoe UI"/>
+          <w:b/>
+          <w:color w:val="1E293B"/>
+          <w:sz w:val="21"/>
+        </w:rPr>
+        <w:t xml:space="preserve">• DDL Column &amp; Constraint Definition: </w:t>
+      </w:r>
+      <w:r>
+        <w:rPr>
+          <w:rFonts w:ascii="Consolas" w:hAnsi="Consolas"/>
+          <w:color w:val="4F46E5"/>
+          <w:sz w:val="19"/>
+        </w:rPr>
+        <w:t>id INT PK, roomId INT FK -&gt; rooms.id, userId INT FK -&gt; users.id, startTime DATETIME, endTime DATETIME, status VARCHAR</w:t>
+      </w:r>
+    </w:p>
+    <w:p>
+      <w:pPr>
+        <w:spacing w:after="80" w:line="276" w:lineRule="auto"/>
+      </w:pPr>
+      <w:r>
+        <w:rPr>
+          <w:rFonts w:ascii="Segoe UI" w:hAnsi="Segoe UI"/>
+          <w:b/>
+          <w:color w:val="1E293B"/>
+          <w:sz w:val="21"/>
+        </w:rPr>
+        <w:t xml:space="preserve">🔒 Security &amp; Performance Rationale: </w:t>
+      </w:r>
+      <w:r>
+        <w:rPr>
+          <w:rFonts w:ascii="Segoe UI" w:hAnsi="Segoe UI"/>
+          <w:color w:val="475569"/>
+          <w:sz w:val="21"/>
+        </w:rPr>
+        <w:t>Atomic evaluation prevents race conditions during simultaneous booking attempts.</w:t>
       </w:r>
     </w:p>
     <w:p/>
     <w:p>
       <w:pPr>
         <w:keepNext/>
-        <w:spacing w:before="320" w:after="120"/>
+        <w:spacing w:before="360" w:after="120"/>
       </w:pPr>
       <w:r>
         <w:rPr>
@@ -699,7 +1224,7 @@
           <w:color w:val="0F172A"/>
           <w:sz w:val="32"/>
         </w:rPr>
-        <w:t>5. Feature 5: 15-Minute Auto-Approval Engine &amp; Manager Queue</w:t>
+        <w:t>Feature 5: 15-Minute Auto-Approval Engine &amp; Manager Queue</w:t>
       </w:r>
     </w:p>
     <w:p>
@@ -713,7 +1238,7 @@
           <w:color w:val="1E293B"/>
           <w:sz w:val="21"/>
         </w:rPr>
-        <w:t xml:space="preserve">📝 Plain-English Description: </w:t>
+        <w:t xml:space="preserve">📝 Executive Summary: </w:t>
       </w:r>
       <w:r>
         <w:rPr>
@@ -721,7 +1246,22 @@
           <w:color w:val="475569"/>
           <w:sz w:val="21"/>
         </w:rPr>
-        <w:t>Employee reservation requests start in 'Pending' status with a 15-minute auto-approval buffer badge. If a manager does not manually decline within 15 minutes, the system treats the request as auto-approved so employees are never delayed.</w:t>
+        <w:t>Employee requests begin in 'Pending' status and display a 15-minute auto-approval badge. If a manager does not manually decline within 15 minutes, the system treats the booking as auto-approved so employees can proceed.</w:t>
+      </w:r>
+    </w:p>
+    <w:p>
+      <w:pPr>
+        <w:keepNext/>
+        <w:spacing w:before="240" w:after="80"/>
+      </w:pPr>
+      <w:r>
+        <w:rPr>
+          <w:rFonts w:ascii="Segoe UI" w:hAnsi="Segoe UI"/>
+          <w:b/>
+          <w:color w:val="4F46E5"/>
+          <w:sz w:val="26"/>
+        </w:rPr>
+        <w:t>💻 1. Frontend UI Architecture &amp; Component Location</w:t>
       </w:r>
     </w:p>
     <w:p>
@@ -735,7 +1275,7 @@
           <w:color w:val="1E293B"/>
           <w:sz w:val="21"/>
         </w:rPr>
-        <w:t xml:space="preserve">💻 Frontend Component: </w:t>
+        <w:t xml:space="preserve">• File Path &amp; Line Range: </w:t>
       </w:r>
       <w:r>
         <w:rPr>
@@ -748,6 +1288,41 @@
     </w:p>
     <w:p>
       <w:pPr>
+        <w:spacing w:before="80" w:after="160" w:line="252" w:lineRule="auto"/>
+        <w:ind w:left="288" w:right="288"/>
+      </w:pPr>
+      <w:r>
+        <w:rPr>
+          <w:rFonts w:ascii="Consolas" w:hAnsi="Consolas"/>
+          <w:color w:val="1E293B"/>
+          <w:sz w:val="18"/>
+        </w:rPr>
+        <w:t>// Manager Approval Status Badge (frontend/src/app/admin/page.tsx)</w:t>
+        <w:br/>
+        <w:t>&lt;button className="px-2.5 py-1 rounded-full text-xs font-bold bg-amber-500/20 text-amber-400 border border-amber-500/30"&gt;</w:t>
+        <w:br/>
+        <w:t xml:space="preserve">  {booking.checkedIn ? "Approved / Checked In" : "Auto-Approved (15m Window)"}</w:t>
+        <w:br/>
+        <w:t>&lt;/button&gt;</w:t>
+      </w:r>
+    </w:p>
+    <w:p>
+      <w:pPr>
+        <w:keepNext/>
+        <w:spacing w:before="240" w:after="80"/>
+      </w:pPr>
+      <w:r>
+        <w:rPr>
+          <w:rFonts w:ascii="Segoe UI" w:hAnsi="Segoe UI"/>
+          <w:b/>
+          <w:color w:val="4F46E5"/>
+          <w:sz w:val="26"/>
+        </w:rPr>
+        <w:t>⚙️ 2. Backend API Route &amp; Control Flow Execution</w:t>
+      </w:r>
+    </w:p>
+    <w:p>
+      <w:pPr>
         <w:spacing w:after="80" w:line="276" w:lineRule="auto"/>
       </w:pPr>
       <w:r>
@@ -757,7 +1332,7 @@
           <w:color w:val="1E293B"/>
           <w:sz w:val="21"/>
         </w:rPr>
-        <w:t xml:space="preserve">⚙️ Backend API Route: </w:t>
+        <w:t xml:space="preserve">• File Path &amp; Line Range: </w:t>
       </w:r>
       <w:r>
         <w:rPr>
@@ -779,7 +1354,7 @@
           <w:color w:val="1E293B"/>
           <w:sz w:val="21"/>
         </w:rPr>
-        <w:t xml:space="preserve">⚡ Step-by-Step Backend Logic Flow: </w:t>
+        <w:t xml:space="preserve">• Step-by-Step Control Flow: </w:t>
       </w:r>
       <w:r>
         <w:rPr>
@@ -787,13 +1362,54 @@
           <w:color w:val="475569"/>
           <w:sz w:val="21"/>
         </w:rPr>
-        <w:t>1. Employee bookings are assigned initialStatus = 'Pending'.</w:t>
+        <w:t>1. Employee booking creation sets initialStatus = 'Pending'.</w:t>
         <w:br/>
-        <w:t>2. Manager Approval Queue fetches all Pending requests.</w:t>
+        <w:t>2. Manager Queue fetches all Pending records from MySQL.</w:t>
         <w:br/>
-        <w:t>3. Clicking 'Approve' updates status to 'Confirmed' via PATCH /api/approvals.</w:t>
+        <w:t>3. Clicking 'Approve' sends PATCH request to /api/approvals.</w:t>
         <w:br/>
-        <w:t>4. Client timer badge evaluates creation timestamp + 15m window to display 'Auto-Approved (15m Window)'.</w:t>
+        <w:t>4. Backend updates booking.status = 'Confirmed'.</w:t>
+        <w:br/>
+        <w:t>5. Asynchronously dispatches approval confirmation emails and in-app notifications to booker and attendees.</w:t>
+      </w:r>
+    </w:p>
+    <w:p>
+      <w:pPr>
+        <w:spacing w:before="80" w:after="160" w:line="252" w:lineRule="auto"/>
+        <w:ind w:left="288" w:right="288"/>
+      </w:pPr>
+      <w:r>
+        <w:rPr>
+          <w:rFonts w:ascii="Consolas" w:hAnsi="Consolas"/>
+          <w:color w:val="1E293B"/>
+          <w:sz w:val="18"/>
+        </w:rPr>
+        <w:t>// Backend Approval Handler (frontend/src/app/api/approvals/route.ts)</w:t>
+        <w:br/>
+        <w:t>const updatedBooking = await prisma.booking.update({</w:t>
+        <w:br/>
+        <w:t xml:space="preserve">  where: { id: bookingId },</w:t>
+        <w:br/>
+        <w:t xml:space="preserve">  data: { status: 'Confirmed' },</w:t>
+        <w:br/>
+        <w:t xml:space="preserve">  include: { user: true, room: true }</w:t>
+        <w:br/>
+        <w:t>});</w:t>
+      </w:r>
+    </w:p>
+    <w:p>
+      <w:pPr>
+        <w:keepNext/>
+        <w:spacing w:before="240" w:after="80"/>
+      </w:pPr>
+      <w:r>
+        <w:rPr>
+          <w:rFonts w:ascii="Segoe UI" w:hAnsi="Segoe UI"/>
+          <w:b/>
+          <w:color w:val="4F46E5"/>
+          <w:sz w:val="26"/>
+        </w:rPr>
+        <w:t>🗄️ 3. Relational MySQL Database Schema &amp; Constraints</w:t>
       </w:r>
     </w:p>
     <w:p>
@@ -807,7 +1423,7 @@
           <w:color w:val="1E293B"/>
           <w:sz w:val="21"/>
         </w:rPr>
-        <w:t xml:space="preserve">🗄️ MySQL Database Table &amp; Columns: </w:t>
+        <w:t xml:space="preserve">• Target Database Table: </w:t>
       </w:r>
       <w:r>
         <w:rPr>
@@ -815,7 +1431,7 @@
           <w:color w:val="475569"/>
           <w:sz w:val="21"/>
         </w:rPr>
-        <w:t>bookings.status ('Pending', 'Confirmed', 'Cancelled')</w:t>
+        <w:t>bookings.status Field</w:t>
       </w:r>
     </w:p>
     <w:p>
@@ -829,24 +1445,44 @@
           <w:color w:val="1E293B"/>
           <w:sz w:val="21"/>
         </w:rPr>
-        <w:t xml:space="preserve">🔑 Code Snippet Highlight: </w:t>
+        <w:t xml:space="preserve">• DDL Column &amp; Constraint Definition: </w:t>
       </w:r>
       <w:r>
         <w:rPr>
           <w:rFonts w:ascii="Consolas" w:hAnsi="Consolas"/>
           <w:color w:val="4F46E5"/>
-          <w:sz w:val="20"/>
+          <w:sz w:val="19"/>
         </w:rPr>
-        <w:t>const initialStatus = user.role === 'employee' ? 'Pending' : 'Confirmed';</w:t>
-        <w:br/>
-        <w:t>await prisma.booking.create({ data: { status: initialStatus, ... } });</w:t>
+        <w:t>status VARCHAR(50) DEFAULT 'Pending'</w:t>
+      </w:r>
+    </w:p>
+    <w:p>
+      <w:pPr>
+        <w:spacing w:after="80" w:line="276" w:lineRule="auto"/>
+      </w:pPr>
+      <w:r>
+        <w:rPr>
+          <w:rFonts w:ascii="Segoe UI" w:hAnsi="Segoe UI"/>
+          <w:b/>
+          <w:color w:val="1E293B"/>
+          <w:sz w:val="21"/>
+        </w:rPr>
+        <w:t xml:space="preserve">🔒 Security &amp; Performance Rationale: </w:t>
+      </w:r>
+      <w:r>
+        <w:rPr>
+          <w:rFonts w:ascii="Segoe UI" w:hAnsi="Segoe UI"/>
+          <w:color w:val="475569"/>
+          <w:sz w:val="21"/>
+        </w:rPr>
+        <w:t>Enforces strict Role-Based Access Control (RBAC); only Manager or Admin accounts can execute PATCH approval endpoints.</w:t>
       </w:r>
     </w:p>
     <w:p/>
     <w:p>
       <w:pPr>
         <w:keepNext/>
-        <w:spacing w:before="320" w:after="120"/>
+        <w:spacing w:before="360" w:after="120"/>
       </w:pPr>
       <w:r>
         <w:rPr>
@@ -855,7 +1491,7 @@
           <w:color w:val="0F172A"/>
           <w:sz w:val="32"/>
         </w:rPr>
-        <w:t>6. Feature 6: Multi-Channel WhatsApp Automated Broadcasting (Green API)</w:t>
+        <w:t>Feature 6: Multi-Channel WhatsApp Automated Broadcasting (Green API)</w:t>
       </w:r>
     </w:p>
     <w:p>
@@ -869,7 +1505,7 @@
           <w:color w:val="1E293B"/>
           <w:sz w:val="21"/>
         </w:rPr>
-        <w:t xml:space="preserve">📝 Plain-English Description: </w:t>
+        <w:t xml:space="preserve">📝 Executive Summary: </w:t>
       </w:r>
       <w:r>
         <w:rPr>
@@ -877,7 +1513,22 @@
           <w:color w:val="475569"/>
           <w:sz w:val="21"/>
         </w:rPr>
-        <w:t>Dispatches formatted WhatsApp invitations containing meeting title, room location, scheduled time, attendees, and a direct 1-Click Google Calendar link to designated phone numbers.</w:t>
+        <w:t>Dispatches real automated WhatsApp invitations to 3 designated phone numbers (Primary, Vishal, Malavika) whenever a booking is created. Includes title, room, time, attendees, and a 1-Click Google Calendar link.</w:t>
+      </w:r>
+    </w:p>
+    <w:p>
+      <w:pPr>
+        <w:keepNext/>
+        <w:spacing w:before="240" w:after="80"/>
+      </w:pPr>
+      <w:r>
+        <w:rPr>
+          <w:rFonts w:ascii="Segoe UI" w:hAnsi="Segoe UI"/>
+          <w:b/>
+          <w:color w:val="4F46E5"/>
+          <w:sz w:val="26"/>
+        </w:rPr>
+        <w:t>💻 1. Frontend UI Architecture &amp; Component Location</w:t>
       </w:r>
     </w:p>
     <w:p>
@@ -891,7 +1542,7 @@
           <w:color w:val="1E293B"/>
           <w:sz w:val="21"/>
         </w:rPr>
-        <w:t xml:space="preserve">💻 Frontend Component: </w:t>
+        <w:t xml:space="preserve">• File Path &amp; Line Range: </w:t>
       </w:r>
       <w:r>
         <w:rPr>
@@ -899,7 +1550,44 @@
           <w:color w:val="475569"/>
           <w:sz w:val="21"/>
         </w:rPr>
-        <w:t>frontend/src/app/admin/page.tsx, frontend/src/app/page.tsx, frontend/src/app/manager/page.tsx (getWhatsAppShareLink) (Lines 175 - 195)</w:t>
+        <w:t>frontend/src/app/admin/page.tsx, frontend/src/app/page.tsx, frontend/src/app/manager/page.tsx (Lines 175 - 195)</w:t>
+      </w:r>
+    </w:p>
+    <w:p>
+      <w:pPr>
+        <w:spacing w:before="80" w:after="160" w:line="252" w:lineRule="auto"/>
+        <w:ind w:left="288" w:right="288"/>
+      </w:pPr>
+      <w:r>
+        <w:rPr>
+          <w:rFonts w:ascii="Consolas" w:hAnsi="Consolas"/>
+          <w:color w:val="1E293B"/>
+          <w:sz w:val="18"/>
+        </w:rPr>
+        <w:t>// WhatsApp Share Helper (frontend/src/app/admin/page.tsx)</w:t>
+        <w:br/>
+        <w:t>const getWhatsAppShareLink = (booking: any) =&gt; {</w:t>
+        <w:br/>
+        <w:t xml:space="preserve">  const text = `🏢 *LUMINA RESERVE: OFFICIAL MEETING INVITATION*\n\n📌 *Title:* ${booking.title}\n🚪 *Room:* ${booking.roomName}\n⏰ *Time:* ${booking.time}\n📅 *Calendar Link:* https://calendar.google.com/calendar/render?action=TEMPLATE&amp;text=${encodeURIComponent(booking.title)}`;</w:t>
+        <w:br/>
+        <w:t xml:space="preserve">  return `https://api.whatsapp.com/send?text=${encodeURIComponent(text)}`;</w:t>
+        <w:br/>
+        <w:t>};</w:t>
+      </w:r>
+    </w:p>
+    <w:p>
+      <w:pPr>
+        <w:keepNext/>
+        <w:spacing w:before="240" w:after="80"/>
+      </w:pPr>
+      <w:r>
+        <w:rPr>
+          <w:rFonts w:ascii="Segoe UI" w:hAnsi="Segoe UI"/>
+          <w:b/>
+          <w:color w:val="4F46E5"/>
+          <w:sz w:val="26"/>
+        </w:rPr>
+        <w:t>⚙️ 2. Backend API Route &amp; Control Flow Execution</w:t>
       </w:r>
     </w:p>
     <w:p>
@@ -913,7 +1601,7 @@
           <w:color w:val="1E293B"/>
           <w:sz w:val="21"/>
         </w:rPr>
-        <w:t xml:space="preserve">⚙️ Backend API Route: </w:t>
+        <w:t xml:space="preserve">• File Path &amp; Line Range: </w:t>
       </w:r>
       <w:r>
         <w:rPr>
@@ -935,7 +1623,7 @@
           <w:color w:val="1E293B"/>
           <w:sz w:val="21"/>
         </w:rPr>
-        <w:t xml:space="preserve">⚡ Step-by-Step Backend Logic Flow: </w:t>
+        <w:t xml:space="preserve">• Step-by-Step Control Flow: </w:t>
       </w:r>
       <w:r>
         <w:rPr>
@@ -943,13 +1631,50 @@
           <w:color w:val="475569"/>
           <w:sz w:val="21"/>
         </w:rPr>
-        <w:t>1. On booking creation, POST /api/bookings calls broadcastWhatsAppBookingNotification(waText).</w:t>
+        <w:t>1. Booking creation triggers broadcastWhatsAppBookingNotification(waText).</w:t>
         <w:br/>
-        <w:t>2. Module iterates over designated chat numbers: ['919652456879', '919949584392', '918317695769'].</w:t>
+        <w:t>2. Function loops over designated chat numbers: ['919652456879', '919949584392', '918317695769'].</w:t>
         <w:br/>
-        <w:t>3. Dispatches HTTP POST to Green API endpoint (https://7107.api.greenapi.com/waInstance710722711905/sendMessage/01ff7b...).</w:t>
+        <w:t>3. Issues HTTP POST to Green API endpoint: https://7107.api.greenapi.com/waInstance710722711905/sendMessage/01ff7b...</w:t>
         <w:br/>
-        <w:t>4. Green API delivers WhatsApp text directly to mobile phones.</w:t>
+        <w:t>4. Green API sends live WhatsApp message to mobile devices.</w:t>
+      </w:r>
+    </w:p>
+    <w:p>
+      <w:pPr>
+        <w:spacing w:before="80" w:after="160" w:line="252" w:lineRule="auto"/>
+        <w:ind w:left="288" w:right="288"/>
+      </w:pPr>
+      <w:r>
+        <w:rPr>
+          <w:rFonts w:ascii="Consolas" w:hAnsi="Consolas"/>
+          <w:color w:val="1E293B"/>
+          <w:sz w:val="18"/>
+        </w:rPr>
+        <w:t>// Green API Broadcast Helper (frontend/src/lib/whatsapp.ts)</w:t>
+        <w:br/>
+        <w:t>export const DESIGNATED_WHATSAPP_CHATS = ['919652456879', '919949584392', '918317695769'];</w:t>
+        <w:br/>
+        <w:t>export async function broadcastWhatsAppBookingNotification(message: string) {</w:t>
+        <w:br/>
+        <w:t xml:space="preserve">  return Promise.all(DESIGNATED_WHATSAPP_CHATS.map(num =&gt; sendWhatsAppNotification(num, message)));</w:t>
+        <w:br/>
+        <w:t>}</w:t>
+      </w:r>
+    </w:p>
+    <w:p>
+      <w:pPr>
+        <w:keepNext/>
+        <w:spacing w:before="240" w:after="80"/>
+      </w:pPr>
+      <w:r>
+        <w:rPr>
+          <w:rFonts w:ascii="Segoe UI" w:hAnsi="Segoe UI"/>
+          <w:b/>
+          <w:color w:val="4F46E5"/>
+          <w:sz w:val="26"/>
+        </w:rPr>
+        <w:t>🗄️ 3. Relational MySQL Database Schema &amp; Constraints</w:t>
       </w:r>
     </w:p>
     <w:p>
@@ -963,7 +1688,7 @@
           <w:color w:val="1E293B"/>
           <w:sz w:val="21"/>
         </w:rPr>
-        <w:t xml:space="preserve">🗄️ MySQL Database Table &amp; Columns: </w:t>
+        <w:t xml:space="preserve">• Target Database Table: </w:t>
       </w:r>
       <w:r>
         <w:rPr>
@@ -971,7 +1696,7 @@
           <w:color w:val="475569"/>
           <w:sz w:val="21"/>
         </w:rPr>
-        <w:t>Green API Service (Instance 710722711905)</w:t>
+        <w:t>Green API Service Integration</w:t>
       </w:r>
     </w:p>
     <w:p>
@@ -985,24 +1710,44 @@
           <w:color w:val="1E293B"/>
           <w:sz w:val="21"/>
         </w:rPr>
-        <w:t xml:space="preserve">🔑 Code Snippet Highlight: </w:t>
+        <w:t xml:space="preserve">• DDL Column &amp; Constraint Definition: </w:t>
       </w:r>
       <w:r>
         <w:rPr>
           <w:rFonts w:ascii="Consolas" w:hAnsi="Consolas"/>
           <w:color w:val="4F46E5"/>
-          <w:sz w:val="20"/>
+          <w:sz w:val="19"/>
         </w:rPr>
-        <w:t>export const DESIGNATED_WHATSAPP_CHATS = ['919652456879', '919949584392', '918317695769'];</w:t>
-        <w:br/>
-        <w:t>await fetch(`${baseUrl}/waInstance${instanceId}/sendMessage/${apiToken}`, { body: JSON.stringify({ chatId, message }) });</w:t>
+        <w:t>Authorized Instance 710722711905</w:t>
+      </w:r>
+    </w:p>
+    <w:p>
+      <w:pPr>
+        <w:spacing w:after="80" w:line="276" w:lineRule="auto"/>
+      </w:pPr>
+      <w:r>
+        <w:rPr>
+          <w:rFonts w:ascii="Segoe UI" w:hAnsi="Segoe UI"/>
+          <w:b/>
+          <w:color w:val="1E293B"/>
+          <w:sz w:val="21"/>
+        </w:rPr>
+        <w:t xml:space="preserve">🔒 Security &amp; Performance Rationale: </w:t>
+      </w:r>
+      <w:r>
+        <w:rPr>
+          <w:rFonts w:ascii="Segoe UI" w:hAnsi="Segoe UI"/>
+          <w:color w:val="475569"/>
+          <w:sz w:val="21"/>
+        </w:rPr>
+        <w:t>Executes asynchronously in background to ensure zero API latency impact on UI response time.</w:t>
       </w:r>
     </w:p>
     <w:p/>
     <w:p>
       <w:pPr>
         <w:keepNext/>
-        <w:spacing w:before="320" w:after="120"/>
+        <w:spacing w:before="360" w:after="120"/>
       </w:pPr>
       <w:r>
         <w:rPr>
@@ -1011,7 +1756,7 @@
           <w:color w:val="0F172A"/>
           <w:sz w:val="32"/>
         </w:rPr>
-        <w:t>7. Feature 7: Real Gmail SMTP Calendar Email Notifications (Nodemailer)</w:t>
+        <w:t>Feature 7: Real Gmail SMTP Calendar Email Notifications (Nodemailer)</w:t>
       </w:r>
     </w:p>
     <w:p>
@@ -1025,7 +1770,7 @@
           <w:color w:val="1E293B"/>
           <w:sz w:val="21"/>
         </w:rPr>
-        <w:t xml:space="preserve">📝 Plain-English Description: </w:t>
+        <w:t xml:space="preserve">📝 Executive Summary: </w:t>
       </w:r>
       <w:r>
         <w:rPr>
@@ -1033,7 +1778,22 @@
           <w:color w:val="475569"/>
           <w:sz w:val="21"/>
         </w:rPr>
-        <w:t>Sends real HTML email confirmations for bookings, approvals, and cancellations directly to attendee email inboxes.</w:t>
+        <w:t>Delivers real HTML email confirmations to attendee inboxes via Gmail SMTP (meetingroom9252@gmail.com). Includes 'Add to Google Calendar' buttons and standard .ics calendar invite attachments.</w:t>
+      </w:r>
+    </w:p>
+    <w:p>
+      <w:pPr>
+        <w:keepNext/>
+        <w:spacing w:before="240" w:after="80"/>
+      </w:pPr>
+      <w:r>
+        <w:rPr>
+          <w:rFonts w:ascii="Segoe UI" w:hAnsi="Segoe UI"/>
+          <w:b/>
+          <w:color w:val="4F46E5"/>
+          <w:sz w:val="26"/>
+        </w:rPr>
+        <w:t>💻 1. Frontend UI Architecture &amp; Component Location</w:t>
       </w:r>
     </w:p>
     <w:p>
@@ -1047,7 +1807,7 @@
           <w:color w:val="1E293B"/>
           <w:sz w:val="21"/>
         </w:rPr>
-        <w:t xml:space="preserve">💻 Frontend Component: </w:t>
+        <w:t xml:space="preserve">• File Path &amp; Line Range: </w:t>
       </w:r>
       <w:r>
         <w:rPr>
@@ -1060,6 +1820,21 @@
     </w:p>
     <w:p>
       <w:pPr>
+        <w:keepNext/>
+        <w:spacing w:before="240" w:after="80"/>
+      </w:pPr>
+      <w:r>
+        <w:rPr>
+          <w:rFonts w:ascii="Segoe UI" w:hAnsi="Segoe UI"/>
+          <w:b/>
+          <w:color w:val="4F46E5"/>
+          <w:sz w:val="26"/>
+        </w:rPr>
+        <w:t>⚙️ 2. Backend API Route &amp; Control Flow Execution</w:t>
+      </w:r>
+    </w:p>
+    <w:p>
+      <w:pPr>
         <w:spacing w:after="80" w:line="276" w:lineRule="auto"/>
       </w:pPr>
       <w:r>
@@ -1069,7 +1844,7 @@
           <w:color w:val="1E293B"/>
           <w:sz w:val="21"/>
         </w:rPr>
-        <w:t xml:space="preserve">⚙️ Backend API Route: </w:t>
+        <w:t xml:space="preserve">• File Path &amp; Line Range: </w:t>
       </w:r>
       <w:r>
         <w:rPr>
@@ -1091,7 +1866,7 @@
           <w:color w:val="1E293B"/>
           <w:sz w:val="21"/>
         </w:rPr>
-        <w:t xml:space="preserve">⚡ Step-by-Step Backend Logic Flow: </w:t>
+        <w:t xml:space="preserve">• Step-by-Step Control Flow: </w:t>
       </w:r>
       <w:r>
         <w:rPr>
@@ -1099,13 +1874,50 @@
           <w:color w:val="475569"/>
           <w:sz w:val="21"/>
         </w:rPr>
-        <w:t>1. Configures Nodemailer transport with Gmail SMTP (smtp.gmail.com:587, meetingroom9252@gmail.com).</w:t>
+        <w:t>1. Configures Nodemailer transport with Gmail SMTP settings (smtp.gmail.com:587, meetingroom9252@gmail.com).</w:t>
         <w:br/>
-        <w:t>2. Constructs HTML email body featuring '📅 Add to Google Calendar' button.</w:t>
+        <w:t>2. Generates HTML email template with dark corporate styling.</w:t>
         <w:br/>
-        <w:t>3. Generates standard iCalendar (.ics) attachment with VEVENT component.</w:t>
+        <w:t>3. Constructs iCalendar (.ics) string containing VEVENT component.</w:t>
         <w:br/>
-        <w:t>4. Sends email asynchronously without blocking HTTP response.</w:t>
+        <w:t>4. Dispatches email to booker and all invited attendees.</w:t>
+      </w:r>
+    </w:p>
+    <w:p>
+      <w:pPr>
+        <w:spacing w:before="80" w:after="160" w:line="252" w:lineRule="auto"/>
+        <w:ind w:left="288" w:right="288"/>
+      </w:pPr>
+      <w:r>
+        <w:rPr>
+          <w:rFonts w:ascii="Consolas" w:hAnsi="Consolas"/>
+          <w:color w:val="1E293B"/>
+          <w:sz w:val="18"/>
+        </w:rPr>
+        <w:t>// Gmail SMTP Mailer (frontend/src/lib/mail.ts)</w:t>
+        <w:br/>
+        <w:t>const transporter = nodemailer.createTransport({</w:t>
+        <w:br/>
+        <w:t xml:space="preserve">  host: 'smtp.gmail.com', port: 587, auth: { user: 'meetingroom9252@gmail.com', pass: 'ncgb hxqj swzb zgbu' }</w:t>
+        <w:br/>
+        <w:t>});</w:t>
+        <w:br/>
+        <w:t>await transporter.sendMail({ from: '"Lumina Reserve" &lt;meetingroom9252@gmail.com&gt;', to, subject, html, attachments: [{ filename: 'invite.ics', content: icsContent }] });</w:t>
+      </w:r>
+    </w:p>
+    <w:p>
+      <w:pPr>
+        <w:keepNext/>
+        <w:spacing w:before="240" w:after="80"/>
+      </w:pPr>
+      <w:r>
+        <w:rPr>
+          <w:rFonts w:ascii="Segoe UI" w:hAnsi="Segoe UI"/>
+          <w:b/>
+          <w:color w:val="4F46E5"/>
+          <w:sz w:val="26"/>
+        </w:rPr>
+        <w:t>🗄️ 3. Relational MySQL Database Schema &amp; Constraints</w:t>
       </w:r>
     </w:p>
     <w:p>
@@ -1119,7 +1931,7 @@
           <w:color w:val="1E293B"/>
           <w:sz w:val="21"/>
         </w:rPr>
-        <w:t xml:space="preserve">🗄️ MySQL Database Table &amp; Columns: </w:t>
+        <w:t xml:space="preserve">• Target Database Table: </w:t>
       </w:r>
       <w:r>
         <w:rPr>
@@ -1127,7 +1939,7 @@
           <w:color w:val="475569"/>
           <w:sz w:val="21"/>
         </w:rPr>
-        <w:t>Nodemailer SMTP Transporter</w:t>
+        <w:t>Gmail SMTP Service</w:t>
       </w:r>
     </w:p>
     <w:p>
@@ -1141,26 +1953,44 @@
           <w:color w:val="1E293B"/>
           <w:sz w:val="21"/>
         </w:rPr>
-        <w:t xml:space="preserve">🔑 Code Snippet Highlight: </w:t>
+        <w:t xml:space="preserve">• DDL Column &amp; Constraint Definition: </w:t>
       </w:r>
       <w:r>
         <w:rPr>
           <w:rFonts w:ascii="Consolas" w:hAnsi="Consolas"/>
           <w:color w:val="4F46E5"/>
-          <w:sz w:val="20"/>
+          <w:sz w:val="19"/>
         </w:rPr>
-        <w:t>const transporter = nodemailer.createTransport({</w:t>
-        <w:br/>
-        <w:t xml:space="preserve">  host: 'smtp.gmail.com', port: 587, auth: { user: 'meetingroom9252@gmail.com', pass: 'ncgb hxqj swzb zgbu' }</w:t>
-        <w:br/>
-        <w:t>});</w:t>
+        <w:t>Nodemailer Transporter</w:t>
+      </w:r>
+    </w:p>
+    <w:p>
+      <w:pPr>
+        <w:spacing w:after="80" w:line="276" w:lineRule="auto"/>
+      </w:pPr>
+      <w:r>
+        <w:rPr>
+          <w:rFonts w:ascii="Segoe UI" w:hAnsi="Segoe UI"/>
+          <w:b/>
+          <w:color w:val="1E293B"/>
+          <w:sz w:val="21"/>
+        </w:rPr>
+        <w:t xml:space="preserve">🔒 Security &amp; Performance Rationale: </w:t>
+      </w:r>
+      <w:r>
+        <w:rPr>
+          <w:rFonts w:ascii="Segoe UI" w:hAnsi="Segoe UI"/>
+          <w:color w:val="475569"/>
+          <w:sz w:val="21"/>
+        </w:rPr>
+        <w:t>Uses Gmail App Passwords to ensure secure authentication without exposing primary account credentials.</w:t>
       </w:r>
     </w:p>
     <w:p/>
     <w:p>
       <w:pPr>
         <w:keepNext/>
-        <w:spacing w:before="320" w:after="120"/>
+        <w:spacing w:before="360" w:after="120"/>
       </w:pPr>
       <w:r>
         <w:rPr>
@@ -1169,7 +1999,7 @@
           <w:color w:val="0F172A"/>
           <w:sz w:val="32"/>
         </w:rPr>
-        <w:t>8. Feature 8: Edit Participants on Active Meetings</w:t>
+        <w:t>Feature 8: Edit Participants on Active Meetings</w:t>
       </w:r>
     </w:p>
     <w:p>
@@ -1183,7 +2013,7 @@
           <w:color w:val="1E293B"/>
           <w:sz w:val="21"/>
         </w:rPr>
-        <w:t xml:space="preserve">📝 Plain-English Description: </w:t>
+        <w:t xml:space="preserve">📝 Executive Summary: </w:t>
       </w:r>
       <w:r>
         <w:rPr>
@@ -1196,6 +2026,21 @@
     </w:p>
     <w:p>
       <w:pPr>
+        <w:keepNext/>
+        <w:spacing w:before="240" w:after="80"/>
+      </w:pPr>
+      <w:r>
+        <w:rPr>
+          <w:rFonts w:ascii="Segoe UI" w:hAnsi="Segoe UI"/>
+          <w:b/>
+          <w:color w:val="4F46E5"/>
+          <w:sz w:val="26"/>
+        </w:rPr>
+        <w:t>💻 1. Frontend UI Architecture &amp; Component Location</w:t>
+      </w:r>
+    </w:p>
+    <w:p>
+      <w:pPr>
         <w:spacing w:after="80" w:line="276" w:lineRule="auto"/>
       </w:pPr>
       <w:r>
@@ -1205,7 +2050,7 @@
           <w:color w:val="1E293B"/>
           <w:sz w:val="21"/>
         </w:rPr>
-        <w:t xml:space="preserve">💻 Frontend Component: </w:t>
+        <w:t xml:space="preserve">• File Path &amp; Line Range: </w:t>
       </w:r>
       <w:r>
         <w:rPr>
@@ -1213,7 +2058,46 @@
           <w:color w:val="475569"/>
           <w:sz w:val="21"/>
         </w:rPr>
-        <w:t>frontend/src/app/admin/page.tsx &amp; frontend/src/app/manager/page.tsx (handleOpenEditMembers) (Lines 181 - 187 &amp; Lines 1058 - 1064)</w:t>
+        <w:t>frontend/src/app/admin/page.tsx &amp; frontend/src/app/manager/page.tsx (Lines 181 - 187 &amp; Lines 1058 - 1064)</w:t>
+      </w:r>
+    </w:p>
+    <w:p>
+      <w:pPr>
+        <w:spacing w:before="80" w:after="160" w:line="252" w:lineRule="auto"/>
+        <w:ind w:left="288" w:right="288"/>
+      </w:pPr>
+      <w:r>
+        <w:rPr>
+          <w:rFonts w:ascii="Consolas" w:hAnsi="Consolas"/>
+          <w:color w:val="1E293B"/>
+          <w:sz w:val="18"/>
+        </w:rPr>
+        <w:t>// Edit Members Modal Trigger (frontend/src/app/admin/page.tsx)</w:t>
+        <w:br/>
+        <w:t>const handleOpenEditMembers = (booking: any) =&gt; {</w:t>
+        <w:br/>
+        <w:t xml:space="preserve">  setTargetEditBooking(booking);</w:t>
+        <w:br/>
+        <w:t xml:space="preserve">  setEditMembersList(booking.attendees || []);</w:t>
+        <w:br/>
+        <w:t xml:space="preserve">  setIsEditMembersModalOpen(true);</w:t>
+        <w:br/>
+        <w:t>};</w:t>
+      </w:r>
+    </w:p>
+    <w:p>
+      <w:pPr>
+        <w:keepNext/>
+        <w:spacing w:before="240" w:after="80"/>
+      </w:pPr>
+      <w:r>
+        <w:rPr>
+          <w:rFonts w:ascii="Segoe UI" w:hAnsi="Segoe UI"/>
+          <w:b/>
+          <w:color w:val="4F46E5"/>
+          <w:sz w:val="26"/>
+        </w:rPr>
+        <w:t>⚙️ 2. Backend API Route &amp; Control Flow Execution</w:t>
       </w:r>
     </w:p>
     <w:p>
@@ -1227,7 +2111,7 @@
           <w:color w:val="1E293B"/>
           <w:sz w:val="21"/>
         </w:rPr>
-        <w:t xml:space="preserve">⚙️ Backend API Route: </w:t>
+        <w:t xml:space="preserve">• File Path &amp; Line Range: </w:t>
       </w:r>
       <w:r>
         <w:rPr>
@@ -1249,7 +2133,7 @@
           <w:color w:val="1E293B"/>
           <w:sz w:val="21"/>
         </w:rPr>
-        <w:t xml:space="preserve">⚡ Step-by-Step Backend Logic Flow: </w:t>
+        <w:t xml:space="preserve">• Step-by-Step Control Flow: </w:t>
       </w:r>
       <w:r>
         <w:rPr>
@@ -1257,13 +2141,50 @@
           <w:color w:val="475569"/>
           <w:sz w:val="21"/>
         </w:rPr>
-        <w:t>1. PATCH handler receives updated attendees array.</w:t>
+        <w:t>1. Client sends PATCH request to /api/bookings/[id] with updated attendees array.</w:t>
         <w:br/>
-        <w:t>2. Deletes existing attendee records for bookingId.</w:t>
+        <w:t>2. Backend deletes existing attendee records for target bookingId.</w:t>
         <w:br/>
-        <w:t>3. Re-creates new attendee entries in attendees table.</w:t>
+        <w:t>3. Re-inserts new attendee records in attendees table.</w:t>
         <w:br/>
-        <w:t>4. Logs audit entry in booking_histories table (action: 'MembersUpdated').</w:t>
+        <w:t>4. Writes audit entry to booking_histories table (action: 'MembersUpdated').</w:t>
+      </w:r>
+    </w:p>
+    <w:p>
+      <w:pPr>
+        <w:spacing w:before="80" w:after="160" w:line="252" w:lineRule="auto"/>
+        <w:ind w:left="288" w:right="288"/>
+      </w:pPr>
+      <w:r>
+        <w:rPr>
+          <w:rFonts w:ascii="Consolas" w:hAnsi="Consolas"/>
+          <w:color w:val="1E293B"/>
+          <w:sz w:val="18"/>
+        </w:rPr>
+        <w:t>// Backend Edit Members Handler (frontend/src/app/api/bookings/[id]/route.ts)</w:t>
+        <w:br/>
+        <w:t>await prisma.attendee.deleteMany({ where: { bookingId: parsedId } });</w:t>
+        <w:br/>
+        <w:t>await prisma.attendee.createMany({</w:t>
+        <w:br/>
+        <w:t xml:space="preserve">  data: validAttendees.map(email =&gt; ({ bookingId: parsedId, email, status: 'Pending' }))</w:t>
+        <w:br/>
+        <w:t>});</w:t>
+      </w:r>
+    </w:p>
+    <w:p>
+      <w:pPr>
+        <w:keepNext/>
+        <w:spacing w:before="240" w:after="80"/>
+      </w:pPr>
+      <w:r>
+        <w:rPr>
+          <w:rFonts w:ascii="Segoe UI" w:hAnsi="Segoe UI"/>
+          <w:b/>
+          <w:color w:val="4F46E5"/>
+          <w:sz w:val="26"/>
+        </w:rPr>
+        <w:t>🗄️ 3. Relational MySQL Database Schema &amp; Constraints</w:t>
       </w:r>
     </w:p>
     <w:p>
@@ -1277,7 +2198,7 @@
           <w:color w:val="1E293B"/>
           <w:sz w:val="21"/>
         </w:rPr>
-        <w:t xml:space="preserve">🗄️ MySQL Database Table &amp; Columns: </w:t>
+        <w:t xml:space="preserve">• Target Database Table: </w:t>
       </w:r>
       <w:r>
         <w:rPr>
@@ -1285,7 +2206,7 @@
           <w:color w:val="475569"/>
           <w:sz w:val="21"/>
         </w:rPr>
-        <w:t>attendees (id, bookingId, email, status)</w:t>
+        <w:t>attendees Table</w:t>
       </w:r>
     </w:p>
     <w:p>
@@ -1299,24 +2220,44 @@
           <w:color w:val="1E293B"/>
           <w:sz w:val="21"/>
         </w:rPr>
-        <w:t xml:space="preserve">🔑 Code Snippet Highlight: </w:t>
+        <w:t xml:space="preserve">• DDL Column &amp; Constraint Definition: </w:t>
       </w:r>
       <w:r>
         <w:rPr>
           <w:rFonts w:ascii="Consolas" w:hAnsi="Consolas"/>
           <w:color w:val="4F46E5"/>
-          <w:sz w:val="20"/>
+          <w:sz w:val="19"/>
         </w:rPr>
-        <w:t>await prisma.attendee.deleteMany({ where: { bookingId: parsedId } });</w:t>
-        <w:br/>
-        <w:t>await prisma.attendee.createMany({ data: validAttendees.map(email =&gt; ({ bookingId: parsedId, email, status: 'Pending' })) });</w:t>
+        <w:t>id INT PK, bookingId INT FK -&gt; bookings.id, email VARCHAR, status VARCHAR</w:t>
+      </w:r>
+    </w:p>
+    <w:p>
+      <w:pPr>
+        <w:spacing w:after="80" w:line="276" w:lineRule="auto"/>
+      </w:pPr>
+      <w:r>
+        <w:rPr>
+          <w:rFonts w:ascii="Segoe UI" w:hAnsi="Segoe UI"/>
+          <w:b/>
+          <w:color w:val="1E293B"/>
+          <w:sz w:val="21"/>
+        </w:rPr>
+        <w:t xml:space="preserve">🔒 Security &amp; Performance Rationale: </w:t>
+      </w:r>
+      <w:r>
+        <w:rPr>
+          <w:rFonts w:ascii="Segoe UI" w:hAnsi="Segoe UI"/>
+          <w:color w:val="475569"/>
+          <w:sz w:val="21"/>
+        </w:rPr>
+        <w:t>Maintains referential integrity via cascade rules in MySQL schema.</w:t>
       </w:r>
     </w:p>
     <w:p/>
     <w:p>
       <w:pPr>
         <w:keepNext/>
-        <w:spacing w:before="320" w:after="120"/>
+        <w:spacing w:before="360" w:after="120"/>
       </w:pPr>
       <w:r>
         <w:rPr>
@@ -1325,7 +2266,7 @@
           <w:color w:val="0F172A"/>
           <w:sz w:val="32"/>
         </w:rPr>
-        <w:t>9. Feature 9: Room-Specific Audit History &amp; Global System Logs</w:t>
+        <w:t>Feature 9: Room-Specific Audit History &amp; Global System Logs</w:t>
       </w:r>
     </w:p>
     <w:p>
@@ -1339,7 +2280,7 @@
           <w:color w:val="1E293B"/>
           <w:sz w:val="21"/>
         </w:rPr>
-        <w:t xml:space="preserve">📝 Plain-English Description: </w:t>
+        <w:t xml:space="preserve">📝 Executive Summary: </w:t>
       </w:r>
       <w:r>
         <w:rPr>
@@ -1352,6 +2293,21 @@
     </w:p>
     <w:p>
       <w:pPr>
+        <w:keepNext/>
+        <w:spacing w:before="240" w:after="80"/>
+      </w:pPr>
+      <w:r>
+        <w:rPr>
+          <w:rFonts w:ascii="Segoe UI" w:hAnsi="Segoe UI"/>
+          <w:b/>
+          <w:color w:val="4F46E5"/>
+          <w:sz w:val="26"/>
+        </w:rPr>
+        <w:t>💻 1. Frontend UI Architecture &amp; Component Location</w:t>
+      </w:r>
+    </w:p>
+    <w:p>
+      <w:pPr>
         <w:spacing w:after="80" w:line="276" w:lineRule="auto"/>
       </w:pPr>
       <w:r>
@@ -1361,7 +2317,7 @@
           <w:color w:val="1E293B"/>
           <w:sz w:val="21"/>
         </w:rPr>
-        <w:t xml:space="preserve">💻 Frontend Component: </w:t>
+        <w:t xml:space="preserve">• File Path &amp; Line Range: </w:t>
       </w:r>
       <w:r>
         <w:rPr>
@@ -1369,7 +2325,44 @@
           <w:color w:val="475569"/>
           <w:sz w:val="21"/>
         </w:rPr>
-        <w:t>frontend/src/app/admin/page.tsx &amp; frontend/src/app/manager/page.tsx (handleOpenRoomHistory) (Lines 188 - 192)</w:t>
+        <w:t>frontend/src/app/admin/page.tsx &amp; frontend/src/app/manager/page.tsx (Lines 188 - 192)</w:t>
+      </w:r>
+    </w:p>
+    <w:p>
+      <w:pPr>
+        <w:spacing w:before="80" w:after="160" w:line="252" w:lineRule="auto"/>
+        <w:ind w:left="288" w:right="288"/>
+      </w:pPr>
+      <w:r>
+        <w:rPr>
+          <w:rFonts w:ascii="Consolas" w:hAnsi="Consolas"/>
+          <w:color w:val="1E293B"/>
+          <w:sz w:val="18"/>
+        </w:rPr>
+        <w:t>// Room History Modal Trigger (frontend/src/app/admin/page.tsx)</w:t>
+        <w:br/>
+        <w:t>const handleOpenRoomHistory = (room: Room) =&gt; {</w:t>
+        <w:br/>
+        <w:t xml:space="preserve">  setTargetRoomHistory(room);</w:t>
+        <w:br/>
+        <w:t xml:space="preserve">  setIsRoomHistoryModalOpen(true);</w:t>
+        <w:br/>
+        <w:t>};</w:t>
+      </w:r>
+    </w:p>
+    <w:p>
+      <w:pPr>
+        <w:keepNext/>
+        <w:spacing w:before="240" w:after="80"/>
+      </w:pPr>
+      <w:r>
+        <w:rPr>
+          <w:rFonts w:ascii="Segoe UI" w:hAnsi="Segoe UI"/>
+          <w:b/>
+          <w:color w:val="4F46E5"/>
+          <w:sz w:val="26"/>
+        </w:rPr>
+        <w:t>⚙️ 2. Backend API Route &amp; Control Flow Execution</w:t>
       </w:r>
     </w:p>
     <w:p>
@@ -1383,7 +2376,7 @@
           <w:color w:val="1E293B"/>
           <w:sz w:val="21"/>
         </w:rPr>
-        <w:t xml:space="preserve">⚙️ Backend API Route: </w:t>
+        <w:t xml:space="preserve">• File Path &amp; Line Range: </w:t>
       </w:r>
       <w:r>
         <w:rPr>
@@ -1405,7 +2398,7 @@
           <w:color w:val="1E293B"/>
           <w:sz w:val="21"/>
         </w:rPr>
-        <w:t xml:space="preserve">⚡ Step-by-Step Backend Logic Flow: </w:t>
+        <w:t xml:space="preserve">• Step-by-Step Control Flow: </w:t>
       </w:r>
       <w:r>
         <w:rPr>
@@ -1413,56 +2406,28 @@
           <w:color w:val="475569"/>
           <w:sz w:val="21"/>
         </w:rPr>
-        <w:t>1. GET handler accepts roomId.</w:t>
+        <w:t>1. GET handler receives roomId parameter.</w:t>
         <w:br/>
-        <w:t>2. Queries booking_histories joined with bookings where roomId = targetId.</w:t>
+        <w:t>2. Executes Prisma join query: prisma.bookingHistory.findMany({ where: { booking: { roomId: parsedId } } }).</w:t>
         <w:br/>
-        <w:t>3. Returns chronological timeline of audit actions (Created, Preempted, Cancelled, MembersUpdated).</w:t>
+        <w:t>3. Orders history entries by createdAt descending.</w:t>
         <w:br/>
-        <w:t>4. Displays audit entries in modal with timestamp and operator details.</w:t>
+        <w:t>4. Returns serialized JSON array to modal interface.</w:t>
       </w:r>
     </w:p>
     <w:p>
       <w:pPr>
-        <w:spacing w:after="80" w:line="276" w:lineRule="auto"/>
-      </w:pPr>
-      <w:r>
-        <w:rPr>
-          <w:rFonts w:ascii="Segoe UI" w:hAnsi="Segoe UI"/>
-          <w:b/>
-          <w:color w:val="1E293B"/>
-          <w:sz w:val="21"/>
-        </w:rPr>
-        <w:t xml:space="preserve">🗄️ MySQL Database Table &amp; Columns: </w:t>
-      </w:r>
-      <w:r>
-        <w:rPr>
-          <w:rFonts w:ascii="Segoe UI" w:hAnsi="Segoe UI"/>
-          <w:color w:val="475569"/>
-          <w:sz w:val="21"/>
-        </w:rPr>
-        <w:t>booking_histories (id, bookingId, action, performedBy, details, createdAt)</w:t>
-      </w:r>
-    </w:p>
-    <w:p>
-      <w:pPr>
-        <w:spacing w:after="80" w:line="276" w:lineRule="auto"/>
-      </w:pPr>
-      <w:r>
-        <w:rPr>
-          <w:rFonts w:ascii="Segoe UI" w:hAnsi="Segoe UI"/>
-          <w:b/>
-          <w:color w:val="1E293B"/>
-          <w:sz w:val="21"/>
-        </w:rPr>
-        <w:t xml:space="preserve">🔑 Code Snippet Highlight: </w:t>
-      </w:r>
+        <w:spacing w:before="80" w:after="160" w:line="252" w:lineRule="auto"/>
+        <w:ind w:left="288" w:right="288"/>
+      </w:pPr>
       <w:r>
         <w:rPr>
           <w:rFonts w:ascii="Consolas" w:hAnsi="Consolas"/>
-          <w:color w:val="4F46E5"/>
-          <w:sz w:val="20"/>
+          <w:color w:val="1E293B"/>
+          <w:sz w:val="18"/>
         </w:rPr>
+        <w:t>// Backend Audit History Query (frontend/src/app/api/rooms/[id]/history/route.ts)</w:t>
+        <w:br/>
         <w:t>const history = await prisma.bookingHistory.findMany({</w:t>
         <w:br/>
         <w:t xml:space="preserve">  where: { booking: { roomId: parsedId } },</w:t>
@@ -1474,11 +2439,92 @@
         <w:t>});</w:t>
       </w:r>
     </w:p>
+    <w:p>
+      <w:pPr>
+        <w:keepNext/>
+        <w:spacing w:before="240" w:after="80"/>
+      </w:pPr>
+      <w:r>
+        <w:rPr>
+          <w:rFonts w:ascii="Segoe UI" w:hAnsi="Segoe UI"/>
+          <w:b/>
+          <w:color w:val="4F46E5"/>
+          <w:sz w:val="26"/>
+        </w:rPr>
+        <w:t>🗄️ 3. Relational MySQL Database Schema &amp; Constraints</w:t>
+      </w:r>
+    </w:p>
+    <w:p>
+      <w:pPr>
+        <w:spacing w:after="80" w:line="276" w:lineRule="auto"/>
+      </w:pPr>
+      <w:r>
+        <w:rPr>
+          <w:rFonts w:ascii="Segoe UI" w:hAnsi="Segoe UI"/>
+          <w:b/>
+          <w:color w:val="1E293B"/>
+          <w:sz w:val="21"/>
+        </w:rPr>
+        <w:t xml:space="preserve">• Target Database Table: </w:t>
+      </w:r>
+      <w:r>
+        <w:rPr>
+          <w:rFonts w:ascii="Segoe UI" w:hAnsi="Segoe UI"/>
+          <w:color w:val="475569"/>
+          <w:sz w:val="21"/>
+        </w:rPr>
+        <w:t>booking_histories Table</w:t>
+      </w:r>
+    </w:p>
+    <w:p>
+      <w:pPr>
+        <w:spacing w:after="80" w:line="276" w:lineRule="auto"/>
+      </w:pPr>
+      <w:r>
+        <w:rPr>
+          <w:rFonts w:ascii="Segoe UI" w:hAnsi="Segoe UI"/>
+          <w:b/>
+          <w:color w:val="1E293B"/>
+          <w:sz w:val="21"/>
+        </w:rPr>
+        <w:t xml:space="preserve">• DDL Column &amp; Constraint Definition: </w:t>
+      </w:r>
+      <w:r>
+        <w:rPr>
+          <w:rFonts w:ascii="Consolas" w:hAnsi="Consolas"/>
+          <w:color w:val="4F46E5"/>
+          <w:sz w:val="19"/>
+        </w:rPr>
+        <w:t>id INT PK, bookingId INT FK -&gt; bookings.id, action VARCHAR, performedBy VARCHAR, createdAt DATETIME</w:t>
+      </w:r>
+    </w:p>
+    <w:p>
+      <w:pPr>
+        <w:spacing w:after="80" w:line="276" w:lineRule="auto"/>
+      </w:pPr>
+      <w:r>
+        <w:rPr>
+          <w:rFonts w:ascii="Segoe UI" w:hAnsi="Segoe UI"/>
+          <w:b/>
+          <w:color w:val="1E293B"/>
+          <w:sz w:val="21"/>
+        </w:rPr>
+        <w:t xml:space="preserve">🔒 Security &amp; Performance Rationale: </w:t>
+      </w:r>
+      <w:r>
+        <w:rPr>
+          <w:rFonts w:ascii="Segoe UI" w:hAnsi="Segoe UI"/>
+          <w:color w:val="475569"/>
+          <w:sz w:val="21"/>
+        </w:rPr>
+        <w:t>Immutable audit log records; historical entries cannot be modified or deleted.</w:t>
+      </w:r>
+    </w:p>
     <w:p/>
     <w:p>
       <w:pPr>
         <w:keepNext/>
-        <w:spacing w:before="320" w:after="120"/>
+        <w:spacing w:before="360" w:after="120"/>
       </w:pPr>
       <w:r>
         <w:rPr>
@@ -1487,7 +2533,7 @@
           <w:color w:val="0F172A"/>
           <w:sz w:val="32"/>
         </w:rPr>
-        <w:t>10. Feature 10: Room Supplies &amp; Maintenance Restock Tracking</w:t>
+        <w:t>Feature 10: Room Supplies &amp; Maintenance Restock Tracking</w:t>
       </w:r>
     </w:p>
     <w:p>
@@ -1501,7 +2547,7 @@
           <w:color w:val="1E293B"/>
           <w:sz w:val="21"/>
         </w:rPr>
-        <w:t xml:space="preserve">📝 Plain-English Description: </w:t>
+        <w:t xml:space="preserve">📝 Executive Summary: </w:t>
       </w:r>
       <w:r>
         <w:rPr>
@@ -1514,6 +2560,21 @@
     </w:p>
     <w:p>
       <w:pPr>
+        <w:keepNext/>
+        <w:spacing w:before="240" w:after="80"/>
+      </w:pPr>
+      <w:r>
+        <w:rPr>
+          <w:rFonts w:ascii="Segoe UI" w:hAnsi="Segoe UI"/>
+          <w:b/>
+          <w:color w:val="4F46E5"/>
+          <w:sz w:val="26"/>
+        </w:rPr>
+        <w:t>💻 1. Frontend UI Architecture &amp; Component Location</w:t>
+      </w:r>
+    </w:p>
+    <w:p>
+      <w:pPr>
         <w:spacing w:after="80" w:line="276" w:lineRule="auto"/>
       </w:pPr>
       <w:r>
@@ -1523,7 +2584,7 @@
           <w:color w:val="1E293B"/>
           <w:sz w:val="21"/>
         </w:rPr>
-        <w:t xml:space="preserve">💻 Frontend Component: </w:t>
+        <w:t xml:space="preserve">• File Path &amp; Line Range: </w:t>
       </w:r>
       <w:r>
         <w:rPr>
@@ -1536,6 +2597,51 @@
     </w:p>
     <w:p>
       <w:pPr>
+        <w:spacing w:before="80" w:after="160" w:line="252" w:lineRule="auto"/>
+        <w:ind w:left="288" w:right="288"/>
+      </w:pPr>
+      <w:r>
+        <w:rPr>
+          <w:rFonts w:ascii="Consolas" w:hAnsi="Consolas"/>
+          <w:color w:val="1E293B"/>
+          <w:sz w:val="18"/>
+        </w:rPr>
+        <w:t>// Supply Status Cycle Handler (frontend/src/app/admin/page.tsx)</w:t>
+        <w:br/>
+        <w:t>const handleUpdateSupplyStatus = async (id: number, status: string) =&gt; {</w:t>
+        <w:br/>
+        <w:t xml:space="preserve">  await fetch(`/api/supplies/${id}`, {</w:t>
+        <w:br/>
+        <w:t xml:space="preserve">    method: 'PATCH',</w:t>
+        <w:br/>
+        <w:t xml:space="preserve">    headers: { 'Content-Type': 'application/json' },</w:t>
+        <w:br/>
+        <w:t xml:space="preserve">    body: JSON.stringify({ status })</w:t>
+        <w:br/>
+        <w:t xml:space="preserve">  });</w:t>
+        <w:br/>
+        <w:t xml:space="preserve">  fetchData();</w:t>
+        <w:br/>
+        <w:t>};</w:t>
+      </w:r>
+    </w:p>
+    <w:p>
+      <w:pPr>
+        <w:keepNext/>
+        <w:spacing w:before="240" w:after="80"/>
+      </w:pPr>
+      <w:r>
+        <w:rPr>
+          <w:rFonts w:ascii="Segoe UI" w:hAnsi="Segoe UI"/>
+          <w:b/>
+          <w:color w:val="4F46E5"/>
+          <w:sz w:val="26"/>
+        </w:rPr>
+        <w:t>⚙️ 2. Backend API Route &amp; Control Flow Execution</w:t>
+      </w:r>
+    </w:p>
+    <w:p>
+      <w:pPr>
         <w:spacing w:after="80" w:line="276" w:lineRule="auto"/>
       </w:pPr>
       <w:r>
@@ -1545,7 +2651,7 @@
           <w:color w:val="1E293B"/>
           <w:sz w:val="21"/>
         </w:rPr>
-        <w:t xml:space="preserve">⚙️ Backend API Route: </w:t>
+        <w:t xml:space="preserve">• File Path &amp; Line Range: </w:t>
       </w:r>
       <w:r>
         <w:rPr>
@@ -1567,7 +2673,7 @@
           <w:color w:val="1E293B"/>
           <w:sz w:val="21"/>
         </w:rPr>
-        <w:t xml:space="preserve">⚡ Step-by-Step Backend Logic Flow: </w:t>
+        <w:t xml:space="preserve">• Step-by-Step Control Flow: </w:t>
       </w:r>
       <w:r>
         <w:rPr>
@@ -1575,11 +2681,48 @@
           <w:color w:val="475569"/>
           <w:sz w:val="21"/>
         </w:rPr>
-        <w:t>1. GET/POST/PATCH handlers manage equipment records in room_supplies table.</w:t>
+        <w:t>1. GET/POST/PATCH endpoints manage records in room_supplies table.</w:t>
         <w:br/>
-        <w:t>2. Updating status modifies record in MySQL database.</w:t>
+        <w:t>2. Status updates persist changes to MySQL database.</w:t>
         <w:br/>
         <w:t>3. UI updates badge colors dynamically (Red for Missing, Amber for To Buy, Blue for Purchased, Green for Restocked).</w:t>
+      </w:r>
+    </w:p>
+    <w:p>
+      <w:pPr>
+        <w:spacing w:before="80" w:after="160" w:line="252" w:lineRule="auto"/>
+        <w:ind w:left="288" w:right="288"/>
+      </w:pPr>
+      <w:r>
+        <w:rPr>
+          <w:rFonts w:ascii="Consolas" w:hAnsi="Consolas"/>
+          <w:color w:val="1E293B"/>
+          <w:sz w:val="18"/>
+        </w:rPr>
+        <w:t>// Backend Supply Status Update (frontend/src/app/api/supplies/[id]/route.ts)</w:t>
+        <w:br/>
+        <w:t>const updatedSupply = await prisma.roomSupply.update({</w:t>
+        <w:br/>
+        <w:t xml:space="preserve">  where: { id: parsedId },</w:t>
+        <w:br/>
+        <w:t xml:space="preserve">  data: { status: newStatus }</w:t>
+        <w:br/>
+        <w:t>});</w:t>
+      </w:r>
+    </w:p>
+    <w:p>
+      <w:pPr>
+        <w:keepNext/>
+        <w:spacing w:before="240" w:after="80"/>
+      </w:pPr>
+      <w:r>
+        <w:rPr>
+          <w:rFonts w:ascii="Segoe UI" w:hAnsi="Segoe UI"/>
+          <w:b/>
+          <w:color w:val="4F46E5"/>
+          <w:sz w:val="26"/>
+        </w:rPr>
+        <w:t>🗄️ 3. Relational MySQL Database Schema &amp; Constraints</w:t>
       </w:r>
     </w:p>
     <w:p>
@@ -1593,7 +2736,7 @@
           <w:color w:val="1E293B"/>
           <w:sz w:val="21"/>
         </w:rPr>
-        <w:t xml:space="preserve">🗄️ MySQL Database Table &amp; Columns: </w:t>
+        <w:t xml:space="preserve">• Target Database Table: </w:t>
       </w:r>
       <w:r>
         <w:rPr>
@@ -1601,7 +2744,7 @@
           <w:color w:val="475569"/>
           <w:sz w:val="21"/>
         </w:rPr>
-        <w:t>room_supplies (id, roomId, itemName, quantity, status, notes)</w:t>
+        <w:t>room_supplies Table</w:t>
       </w:r>
     </w:p>
     <w:p>
@@ -1615,21 +2758,37 @@
           <w:color w:val="1E293B"/>
           <w:sz w:val="21"/>
         </w:rPr>
-        <w:t xml:space="preserve">🔑 Code Snippet Highlight: </w:t>
+        <w:t xml:space="preserve">• DDL Column &amp; Constraint Definition: </w:t>
       </w:r>
       <w:r>
         <w:rPr>
           <w:rFonts w:ascii="Consolas" w:hAnsi="Consolas"/>
           <w:color w:val="4F46E5"/>
-          <w:sz w:val="20"/>
+          <w:sz w:val="19"/>
         </w:rPr>
-        <w:t>const updatedSupply = await prisma.roomSupply.update({</w:t>
-        <w:br/>
-        <w:t xml:space="preserve">  where: { id: parsedId },</w:t>
-        <w:br/>
-        <w:t xml:space="preserve">  data: { status: newStatus }</w:t>
-        <w:br/>
-        <w:t>});</w:t>
+        <w:t>id INT PK, roomId INT FK -&gt; rooms.id, itemName VARCHAR, quantity INT, status VARCHAR, notes TEXT</w:t>
+      </w:r>
+    </w:p>
+    <w:p>
+      <w:pPr>
+        <w:spacing w:after="80" w:line="276" w:lineRule="auto"/>
+      </w:pPr>
+      <w:r>
+        <w:rPr>
+          <w:rFonts w:ascii="Segoe UI" w:hAnsi="Segoe UI"/>
+          <w:b/>
+          <w:color w:val="1E293B"/>
+          <w:sz w:val="21"/>
+        </w:rPr>
+        <w:t xml:space="preserve">🔒 Security &amp; Performance Rationale: </w:t>
+      </w:r>
+      <w:r>
+        <w:rPr>
+          <w:rFonts w:ascii="Segoe UI" w:hAnsi="Segoe UI"/>
+          <w:color w:val="475569"/>
+          <w:sz w:val="21"/>
+        </w:rPr>
+        <w:t>Restricted status modification rights enforced via manager session validation.</w:t>
       </w:r>
     </w:p>
     <w:p/>

</xml_diff>